<commit_message>
docs: expand competition technical materials
</commit_message>
<xml_diff>
--- a/competition_submission_materials/validation/test_data_report.docx
+++ b/competition_submission_materials/validation/test_data_report.docx
@@ -5,6 +5,7 @@
     <w:p>
       <w:pPr>
         <w:pStyle w:val="2"/>
+        <w:spacing w:line="360" w:lineRule="auto"/>
         <w:rPr>
           <w:rFonts w:hint="eastAsia" w:ascii="宋体" w:hAnsi="宋体" w:eastAsia="宋体" w:cs="宋体"/>
           <w:color w:val="000000" w:themeColor="text1"/>
@@ -36,6 +37,7 @@
     <w:p>
       <w:pPr>
         <w:pStyle w:val="4"/>
+        <w:spacing w:line="360" w:lineRule="auto"/>
         <w:rPr>
           <w:rFonts w:hint="eastAsia" w:ascii="宋体" w:hAnsi="宋体" w:eastAsia="宋体" w:cs="宋体"/>
           <w:color w:val="000000" w:themeColor="text1"/>
@@ -81,6 +83,8 @@
     <w:p>
       <w:pPr>
         <w:pStyle w:val="23"/>
+        <w:spacing w:line="360" w:lineRule="auto"/>
+        <w:ind w:firstLine="480" w:firstLineChars="200"/>
         <w:rPr>
           <w:rFonts w:hint="eastAsia" w:ascii="宋体" w:hAnsi="宋体" w:eastAsia="宋体" w:cs="宋体"/>
           <w:color w:val="000000" w:themeColor="text1"/>
@@ -195,6 +199,8 @@
     <w:p>
       <w:pPr>
         <w:pStyle w:val="3"/>
+        <w:spacing w:line="360" w:lineRule="auto"/>
+        <w:ind w:firstLine="480" w:firstLineChars="200"/>
         <w:rPr>
           <w:rFonts w:hint="eastAsia" w:ascii="宋体" w:hAnsi="宋体" w:eastAsia="宋体" w:cs="宋体"/>
           <w:color w:val="000000" w:themeColor="text1"/>
@@ -226,6 +232,7 @@
     <w:p>
       <w:pPr>
         <w:pStyle w:val="4"/>
+        <w:spacing w:line="360" w:lineRule="auto"/>
         <w:rPr>
           <w:rFonts w:hint="eastAsia" w:ascii="宋体" w:hAnsi="宋体" w:eastAsia="宋体" w:cs="宋体"/>
           <w:color w:val="000000" w:themeColor="text1"/>
@@ -301,6 +308,7 @@
           <w:p>
             <w:pPr>
               <w:pStyle w:val="24"/>
+              <w:spacing w:line="360" w:lineRule="auto"/>
               <w:rPr>
                 <w:rFonts w:hint="eastAsia" w:ascii="宋体" w:hAnsi="宋体" w:eastAsia="宋体" w:cs="宋体"/>
                 <w:color w:val="000000" w:themeColor="text1"/>
@@ -333,6 +341,7 @@
           <w:p>
             <w:pPr>
               <w:pStyle w:val="24"/>
+              <w:spacing w:line="360" w:lineRule="auto"/>
               <w:rPr>
                 <w:rFonts w:hint="eastAsia" w:ascii="宋体" w:hAnsi="宋体" w:eastAsia="宋体" w:cs="宋体"/>
                 <w:color w:val="000000" w:themeColor="text1"/>
@@ -375,6 +384,7 @@
           <w:p>
             <w:pPr>
               <w:pStyle w:val="24"/>
+              <w:spacing w:line="360" w:lineRule="auto"/>
               <w:rPr>
                 <w:rFonts w:hint="eastAsia" w:ascii="宋体" w:hAnsi="宋体" w:eastAsia="宋体" w:cs="宋体"/>
                 <w:color w:val="000000" w:themeColor="text1"/>
@@ -407,6 +417,7 @@
           <w:p>
             <w:pPr>
               <w:pStyle w:val="24"/>
+              <w:spacing w:line="360" w:lineRule="auto"/>
               <w:rPr>
                 <w:rFonts w:hint="eastAsia" w:ascii="宋体" w:hAnsi="宋体" w:eastAsia="宋体" w:cs="宋体"/>
                 <w:color w:val="000000" w:themeColor="text1"/>
@@ -449,6 +460,7 @@
           <w:p>
             <w:pPr>
               <w:pStyle w:val="24"/>
+              <w:spacing w:line="360" w:lineRule="auto"/>
               <w:rPr>
                 <w:rFonts w:hint="eastAsia" w:ascii="宋体" w:hAnsi="宋体" w:eastAsia="宋体" w:cs="宋体"/>
                 <w:color w:val="000000" w:themeColor="text1"/>
@@ -481,6 +493,7 @@
           <w:p>
             <w:pPr>
               <w:pStyle w:val="24"/>
+              <w:spacing w:line="360" w:lineRule="auto"/>
               <w:rPr>
                 <w:rFonts w:hint="eastAsia" w:ascii="宋体" w:hAnsi="宋体" w:eastAsia="宋体" w:cs="宋体"/>
                 <w:color w:val="000000" w:themeColor="text1"/>
@@ -523,6 +536,7 @@
           <w:p>
             <w:pPr>
               <w:pStyle w:val="24"/>
+              <w:spacing w:line="360" w:lineRule="auto"/>
               <w:rPr>
                 <w:rFonts w:hint="eastAsia" w:ascii="宋体" w:hAnsi="宋体" w:eastAsia="宋体" w:cs="宋体"/>
                 <w:color w:val="000000" w:themeColor="text1"/>
@@ -555,6 +569,7 @@
           <w:p>
             <w:pPr>
               <w:pStyle w:val="24"/>
+              <w:spacing w:line="360" w:lineRule="auto"/>
               <w:rPr>
                 <w:rFonts w:hint="eastAsia" w:ascii="宋体" w:hAnsi="宋体" w:eastAsia="宋体" w:cs="宋体"/>
                 <w:color w:val="000000" w:themeColor="text1"/>
@@ -597,6 +612,7 @@
           <w:p>
             <w:pPr>
               <w:pStyle w:val="24"/>
+              <w:spacing w:line="360" w:lineRule="auto"/>
               <w:rPr>
                 <w:rFonts w:hint="eastAsia" w:ascii="宋体" w:hAnsi="宋体" w:eastAsia="宋体" w:cs="宋体"/>
                 <w:color w:val="000000" w:themeColor="text1"/>
@@ -629,6 +645,7 @@
           <w:p>
             <w:pPr>
               <w:pStyle w:val="24"/>
+              <w:spacing w:line="360" w:lineRule="auto"/>
               <w:rPr>
                 <w:rFonts w:hint="eastAsia" w:ascii="宋体" w:hAnsi="宋体" w:eastAsia="宋体" w:cs="宋体"/>
                 <w:color w:val="000000" w:themeColor="text1"/>
@@ -671,6 +688,7 @@
           <w:p>
             <w:pPr>
               <w:pStyle w:val="24"/>
+              <w:spacing w:line="360" w:lineRule="auto"/>
               <w:rPr>
                 <w:rFonts w:hint="eastAsia" w:ascii="宋体" w:hAnsi="宋体" w:eastAsia="宋体" w:cs="宋体"/>
                 <w:color w:val="000000" w:themeColor="text1"/>
@@ -703,6 +721,7 @@
           <w:p>
             <w:pPr>
               <w:pStyle w:val="24"/>
+              <w:spacing w:line="360" w:lineRule="auto"/>
               <w:rPr>
                 <w:rFonts w:hint="eastAsia" w:ascii="宋体" w:hAnsi="宋体" w:eastAsia="宋体" w:cs="宋体"/>
                 <w:color w:val="000000" w:themeColor="text1"/>
@@ -759,6 +778,7 @@
           <w:p>
             <w:pPr>
               <w:pStyle w:val="24"/>
+              <w:spacing w:line="360" w:lineRule="auto"/>
               <w:rPr>
                 <w:rFonts w:hint="eastAsia" w:ascii="宋体" w:hAnsi="宋体" w:eastAsia="宋体" w:cs="宋体"/>
                 <w:color w:val="000000" w:themeColor="text1"/>
@@ -791,6 +811,7 @@
           <w:p>
             <w:pPr>
               <w:pStyle w:val="24"/>
+              <w:spacing w:line="360" w:lineRule="auto"/>
               <w:rPr>
                 <w:rFonts w:hint="eastAsia" w:ascii="宋体" w:hAnsi="宋体" w:eastAsia="宋体" w:cs="宋体"/>
                 <w:color w:val="000000" w:themeColor="text1"/>
@@ -861,6 +882,7 @@
           <w:p>
             <w:pPr>
               <w:pStyle w:val="24"/>
+              <w:spacing w:line="360" w:lineRule="auto"/>
               <w:rPr>
                 <w:rFonts w:hint="eastAsia" w:ascii="宋体" w:hAnsi="宋体" w:eastAsia="宋体" w:cs="宋体"/>
                 <w:color w:val="000000" w:themeColor="text1"/>
@@ -893,6 +915,7 @@
           <w:p>
             <w:pPr>
               <w:pStyle w:val="24"/>
+              <w:spacing w:line="360" w:lineRule="auto"/>
               <w:rPr>
                 <w:rFonts w:hint="eastAsia" w:ascii="宋体" w:hAnsi="宋体" w:eastAsia="宋体" w:cs="宋体"/>
                 <w:color w:val="000000" w:themeColor="text1"/>
@@ -935,6 +958,7 @@
           <w:p>
             <w:pPr>
               <w:pStyle w:val="24"/>
+              <w:spacing w:line="360" w:lineRule="auto"/>
               <w:rPr>
                 <w:rFonts w:hint="eastAsia" w:ascii="宋体" w:hAnsi="宋体" w:eastAsia="宋体" w:cs="宋体"/>
                 <w:color w:val="000000" w:themeColor="text1"/>
@@ -967,6 +991,7 @@
           <w:p>
             <w:pPr>
               <w:pStyle w:val="24"/>
+              <w:spacing w:line="360" w:lineRule="auto"/>
               <w:rPr>
                 <w:rFonts w:hint="eastAsia" w:ascii="宋体" w:hAnsi="宋体" w:eastAsia="宋体" w:cs="宋体"/>
                 <w:color w:val="000000" w:themeColor="text1"/>
@@ -1009,6 +1034,7 @@
           <w:p>
             <w:pPr>
               <w:pStyle w:val="24"/>
+              <w:spacing w:line="360" w:lineRule="auto"/>
               <w:rPr>
                 <w:rFonts w:hint="eastAsia" w:ascii="宋体" w:hAnsi="宋体" w:eastAsia="宋体" w:cs="宋体"/>
                 <w:color w:val="000000" w:themeColor="text1"/>
@@ -1041,6 +1067,7 @@
           <w:p>
             <w:pPr>
               <w:pStyle w:val="24"/>
+              <w:spacing w:line="360" w:lineRule="auto"/>
               <w:rPr>
                 <w:rFonts w:hint="eastAsia" w:ascii="宋体" w:hAnsi="宋体" w:eastAsia="宋体" w:cs="宋体"/>
                 <w:color w:val="000000" w:themeColor="text1"/>
@@ -1075,6 +1102,7 @@
     <w:p>
       <w:pPr>
         <w:pStyle w:val="4"/>
+        <w:spacing w:line="360" w:lineRule="auto"/>
         <w:rPr>
           <w:rFonts w:hint="eastAsia" w:ascii="宋体" w:hAnsi="宋体" w:eastAsia="宋体" w:cs="宋体"/>
           <w:color w:val="000000" w:themeColor="text1"/>
@@ -1120,6 +1148,8 @@
     <w:p>
       <w:pPr>
         <w:pStyle w:val="23"/>
+        <w:spacing w:line="360" w:lineRule="auto"/>
+        <w:ind w:firstLine="480" w:firstLineChars="200"/>
         <w:rPr>
           <w:rFonts w:hint="eastAsia" w:ascii="宋体" w:hAnsi="宋体" w:eastAsia="宋体" w:cs="宋体"/>
           <w:color w:val="000000" w:themeColor="text1"/>
@@ -1297,6 +1327,7 @@
           <w:p>
             <w:pPr>
               <w:pStyle w:val="24"/>
+              <w:spacing w:line="360" w:lineRule="auto"/>
               <w:rPr>
                 <w:rFonts w:hint="eastAsia" w:ascii="宋体" w:hAnsi="宋体" w:eastAsia="宋体" w:cs="宋体"/>
                 <w:color w:val="000000" w:themeColor="text1"/>
@@ -1329,6 +1360,7 @@
           <w:p>
             <w:pPr>
               <w:pStyle w:val="24"/>
+              <w:spacing w:line="360" w:lineRule="auto"/>
               <w:rPr>
                 <w:rFonts w:hint="eastAsia" w:ascii="宋体" w:hAnsi="宋体" w:eastAsia="宋体" w:cs="宋体"/>
                 <w:color w:val="000000" w:themeColor="text1"/>
@@ -1361,6 +1393,7 @@
           <w:p>
             <w:pPr>
               <w:pStyle w:val="24"/>
+              <w:spacing w:line="360" w:lineRule="auto"/>
               <w:rPr>
                 <w:rFonts w:hint="eastAsia" w:ascii="宋体" w:hAnsi="宋体" w:eastAsia="宋体" w:cs="宋体"/>
                 <w:color w:val="000000" w:themeColor="text1"/>
@@ -1393,6 +1426,7 @@
           <w:p>
             <w:pPr>
               <w:pStyle w:val="24"/>
+              <w:spacing w:line="360" w:lineRule="auto"/>
               <w:jc w:val="right"/>
               <w:rPr>
                 <w:rFonts w:hint="eastAsia" w:ascii="宋体" w:hAnsi="宋体" w:eastAsia="宋体" w:cs="宋体"/>
@@ -1426,6 +1460,7 @@
           <w:p>
             <w:pPr>
               <w:pStyle w:val="24"/>
+              <w:spacing w:line="360" w:lineRule="auto"/>
               <w:rPr>
                 <w:rFonts w:hint="eastAsia" w:ascii="宋体" w:hAnsi="宋体" w:eastAsia="宋体" w:cs="宋体"/>
                 <w:color w:val="000000" w:themeColor="text1"/>
@@ -1458,6 +1493,7 @@
           <w:p>
             <w:pPr>
               <w:pStyle w:val="24"/>
+              <w:spacing w:line="360" w:lineRule="auto"/>
               <w:rPr>
                 <w:rFonts w:hint="eastAsia" w:ascii="宋体" w:hAnsi="宋体" w:eastAsia="宋体" w:cs="宋体"/>
                 <w:color w:val="000000" w:themeColor="text1"/>
@@ -1504,6 +1540,7 @@
           <w:p>
             <w:pPr>
               <w:pStyle w:val="24"/>
+              <w:spacing w:line="360" w:lineRule="auto"/>
               <w:rPr>
                 <w:rFonts w:hint="eastAsia" w:ascii="宋体" w:hAnsi="宋体" w:eastAsia="宋体" w:cs="宋体"/>
                 <w:color w:val="000000" w:themeColor="text1"/>
@@ -1546,6 +1583,7 @@
           <w:p>
             <w:pPr>
               <w:pStyle w:val="24"/>
+              <w:spacing w:line="360" w:lineRule="auto"/>
               <w:rPr>
                 <w:rFonts w:hint="eastAsia" w:ascii="宋体" w:hAnsi="宋体" w:eastAsia="宋体" w:cs="宋体"/>
                 <w:color w:val="000000" w:themeColor="text1"/>
@@ -1578,6 +1616,7 @@
           <w:p>
             <w:pPr>
               <w:pStyle w:val="24"/>
+              <w:spacing w:line="360" w:lineRule="auto"/>
               <w:rPr>
                 <w:rFonts w:hint="eastAsia" w:ascii="宋体" w:hAnsi="宋体" w:eastAsia="宋体" w:cs="宋体"/>
                 <w:color w:val="000000" w:themeColor="text1"/>
@@ -1610,6 +1649,7 @@
           <w:p>
             <w:pPr>
               <w:pStyle w:val="24"/>
+              <w:spacing w:line="360" w:lineRule="auto"/>
               <w:rPr>
                 <w:rFonts w:hint="eastAsia" w:ascii="宋体" w:hAnsi="宋体" w:eastAsia="宋体" w:cs="宋体"/>
                 <w:color w:val="000000" w:themeColor="text1"/>
@@ -1642,6 +1682,7 @@
           <w:p>
             <w:pPr>
               <w:pStyle w:val="24"/>
+              <w:spacing w:line="360" w:lineRule="auto"/>
               <w:jc w:val="right"/>
               <w:rPr>
                 <w:rFonts w:hint="eastAsia" w:ascii="宋体" w:hAnsi="宋体" w:eastAsia="宋体" w:cs="宋体"/>
@@ -1675,6 +1716,7 @@
           <w:p>
             <w:pPr>
               <w:pStyle w:val="24"/>
+              <w:spacing w:line="360" w:lineRule="auto"/>
               <w:rPr>
                 <w:rFonts w:hint="eastAsia" w:ascii="宋体" w:hAnsi="宋体" w:eastAsia="宋体" w:cs="宋体"/>
                 <w:color w:val="000000" w:themeColor="text1"/>
@@ -1707,6 +1749,7 @@
           <w:p>
             <w:pPr>
               <w:pStyle w:val="24"/>
+              <w:spacing w:line="360" w:lineRule="auto"/>
               <w:rPr>
                 <w:rFonts w:hint="eastAsia" w:ascii="宋体" w:hAnsi="宋体" w:eastAsia="宋体" w:cs="宋体"/>
                 <w:color w:val="000000" w:themeColor="text1"/>
@@ -1739,6 +1782,7 @@
           <w:p>
             <w:pPr>
               <w:pStyle w:val="24"/>
+              <w:spacing w:line="360" w:lineRule="auto"/>
               <w:rPr>
                 <w:rFonts w:hint="eastAsia" w:ascii="宋体" w:hAnsi="宋体" w:eastAsia="宋体" w:cs="宋体"/>
                 <w:color w:val="000000" w:themeColor="text1"/>
@@ -1781,6 +1825,7 @@
           <w:p>
             <w:pPr>
               <w:pStyle w:val="24"/>
+              <w:spacing w:line="360" w:lineRule="auto"/>
               <w:rPr>
                 <w:rFonts w:hint="eastAsia" w:ascii="宋体" w:hAnsi="宋体" w:eastAsia="宋体" w:cs="宋体"/>
                 <w:color w:val="000000" w:themeColor="text1"/>
@@ -1813,6 +1858,7 @@
           <w:p>
             <w:pPr>
               <w:pStyle w:val="24"/>
+              <w:spacing w:line="360" w:lineRule="auto"/>
               <w:rPr>
                 <w:rFonts w:hint="eastAsia" w:ascii="宋体" w:hAnsi="宋体" w:eastAsia="宋体" w:cs="宋体"/>
                 <w:color w:val="000000" w:themeColor="text1"/>
@@ -1845,6 +1891,7 @@
           <w:p>
             <w:pPr>
               <w:pStyle w:val="24"/>
+              <w:spacing w:line="360" w:lineRule="auto"/>
               <w:rPr>
                 <w:rFonts w:hint="eastAsia" w:ascii="宋体" w:hAnsi="宋体" w:eastAsia="宋体" w:cs="宋体"/>
                 <w:color w:val="000000" w:themeColor="text1"/>
@@ -1877,6 +1924,7 @@
           <w:p>
             <w:pPr>
               <w:pStyle w:val="24"/>
+              <w:spacing w:line="360" w:lineRule="auto"/>
               <w:jc w:val="right"/>
               <w:rPr>
                 <w:rFonts w:hint="eastAsia" w:ascii="宋体" w:hAnsi="宋体" w:eastAsia="宋体" w:cs="宋体"/>
@@ -1910,6 +1958,7 @@
           <w:p>
             <w:pPr>
               <w:pStyle w:val="24"/>
+              <w:spacing w:line="360" w:lineRule="auto"/>
               <w:rPr>
                 <w:rFonts w:hint="eastAsia" w:ascii="宋体" w:hAnsi="宋体" w:eastAsia="宋体" w:cs="宋体"/>
                 <w:color w:val="000000" w:themeColor="text1"/>
@@ -1942,6 +1991,7 @@
           <w:p>
             <w:pPr>
               <w:pStyle w:val="24"/>
+              <w:spacing w:line="360" w:lineRule="auto"/>
               <w:rPr>
                 <w:rFonts w:hint="eastAsia" w:ascii="宋体" w:hAnsi="宋体" w:eastAsia="宋体" w:cs="宋体"/>
                 <w:color w:val="000000" w:themeColor="text1"/>
@@ -1974,6 +2024,7 @@
           <w:p>
             <w:pPr>
               <w:pStyle w:val="24"/>
+              <w:spacing w:line="360" w:lineRule="auto"/>
               <w:rPr>
                 <w:rFonts w:hint="eastAsia" w:ascii="宋体" w:hAnsi="宋体" w:eastAsia="宋体" w:cs="宋体"/>
                 <w:color w:val="000000" w:themeColor="text1"/>
@@ -2016,6 +2067,7 @@
           <w:p>
             <w:pPr>
               <w:pStyle w:val="24"/>
+              <w:spacing w:line="360" w:lineRule="auto"/>
               <w:rPr>
                 <w:rFonts w:hint="eastAsia" w:ascii="宋体" w:hAnsi="宋体" w:eastAsia="宋体" w:cs="宋体"/>
                 <w:color w:val="000000" w:themeColor="text1"/>
@@ -2048,6 +2100,7 @@
           <w:p>
             <w:pPr>
               <w:pStyle w:val="24"/>
+              <w:spacing w:line="360" w:lineRule="auto"/>
               <w:rPr>
                 <w:rFonts w:hint="eastAsia" w:ascii="宋体" w:hAnsi="宋体" w:eastAsia="宋体" w:cs="宋体"/>
                 <w:color w:val="000000" w:themeColor="text1"/>
@@ -2080,6 +2133,7 @@
           <w:p>
             <w:pPr>
               <w:pStyle w:val="24"/>
+              <w:spacing w:line="360" w:lineRule="auto"/>
               <w:rPr>
                 <w:rFonts w:hint="eastAsia" w:ascii="宋体" w:hAnsi="宋体" w:eastAsia="宋体" w:cs="宋体"/>
                 <w:color w:val="000000" w:themeColor="text1"/>
@@ -2126,6 +2180,7 @@
           <w:p>
             <w:pPr>
               <w:pStyle w:val="24"/>
+              <w:spacing w:line="360" w:lineRule="auto"/>
               <w:jc w:val="right"/>
               <w:rPr>
                 <w:rFonts w:hint="eastAsia" w:ascii="宋体" w:hAnsi="宋体" w:eastAsia="宋体" w:cs="宋体"/>
@@ -2159,6 +2214,7 @@
           <w:p>
             <w:pPr>
               <w:pStyle w:val="24"/>
+              <w:spacing w:line="360" w:lineRule="auto"/>
               <w:rPr>
                 <w:rFonts w:hint="eastAsia" w:ascii="宋体" w:hAnsi="宋体" w:eastAsia="宋体" w:cs="宋体"/>
                 <w:color w:val="000000" w:themeColor="text1"/>
@@ -2191,6 +2247,7 @@
           <w:p>
             <w:pPr>
               <w:pStyle w:val="24"/>
+              <w:spacing w:line="360" w:lineRule="auto"/>
               <w:rPr>
                 <w:rFonts w:hint="eastAsia" w:ascii="宋体" w:hAnsi="宋体" w:eastAsia="宋体" w:cs="宋体"/>
                 <w:color w:val="000000" w:themeColor="text1"/>
@@ -2223,6 +2280,7 @@
           <w:p>
             <w:pPr>
               <w:pStyle w:val="24"/>
+              <w:spacing w:line="360" w:lineRule="auto"/>
               <w:rPr>
                 <w:rFonts w:hint="eastAsia" w:ascii="宋体" w:hAnsi="宋体" w:eastAsia="宋体" w:cs="宋体"/>
                 <w:color w:val="000000" w:themeColor="text1"/>
@@ -2265,6 +2323,7 @@
           <w:p>
             <w:pPr>
               <w:pStyle w:val="24"/>
+              <w:spacing w:line="360" w:lineRule="auto"/>
               <w:rPr>
                 <w:rFonts w:hint="eastAsia" w:ascii="宋体" w:hAnsi="宋体" w:eastAsia="宋体" w:cs="宋体"/>
                 <w:color w:val="000000" w:themeColor="text1"/>
@@ -2297,6 +2356,7 @@
           <w:p>
             <w:pPr>
               <w:pStyle w:val="24"/>
+              <w:spacing w:line="360" w:lineRule="auto"/>
               <w:rPr>
                 <w:rFonts w:hint="eastAsia" w:ascii="宋体" w:hAnsi="宋体" w:eastAsia="宋体" w:cs="宋体"/>
                 <w:color w:val="000000" w:themeColor="text1"/>
@@ -2329,6 +2389,7 @@
           <w:p>
             <w:pPr>
               <w:pStyle w:val="24"/>
+              <w:spacing w:line="360" w:lineRule="auto"/>
               <w:rPr>
                 <w:rFonts w:hint="eastAsia" w:ascii="宋体" w:hAnsi="宋体" w:eastAsia="宋体" w:cs="宋体"/>
                 <w:color w:val="000000" w:themeColor="text1"/>
@@ -2375,6 +2436,7 @@
           <w:p>
             <w:pPr>
               <w:pStyle w:val="24"/>
+              <w:spacing w:line="360" w:lineRule="auto"/>
               <w:jc w:val="right"/>
               <w:rPr>
                 <w:rFonts w:hint="eastAsia" w:ascii="宋体" w:hAnsi="宋体" w:eastAsia="宋体" w:cs="宋体"/>
@@ -2408,6 +2470,7 @@
           <w:p>
             <w:pPr>
               <w:pStyle w:val="24"/>
+              <w:spacing w:line="360" w:lineRule="auto"/>
               <w:rPr>
                 <w:rFonts w:hint="eastAsia" w:ascii="宋体" w:hAnsi="宋体" w:eastAsia="宋体" w:cs="宋体"/>
                 <w:color w:val="000000" w:themeColor="text1"/>
@@ -2440,6 +2503,7 @@
           <w:p>
             <w:pPr>
               <w:pStyle w:val="24"/>
+              <w:spacing w:line="360" w:lineRule="auto"/>
               <w:rPr>
                 <w:rFonts w:hint="eastAsia" w:ascii="宋体" w:hAnsi="宋体" w:eastAsia="宋体" w:cs="宋体"/>
                 <w:color w:val="000000" w:themeColor="text1"/>
@@ -2472,6 +2536,7 @@
           <w:p>
             <w:pPr>
               <w:pStyle w:val="24"/>
+              <w:spacing w:line="360" w:lineRule="auto"/>
               <w:rPr>
                 <w:rFonts w:hint="eastAsia" w:ascii="宋体" w:hAnsi="宋体" w:eastAsia="宋体" w:cs="宋体"/>
                 <w:color w:val="000000" w:themeColor="text1"/>
@@ -2514,6 +2579,7 @@
           <w:p>
             <w:pPr>
               <w:pStyle w:val="24"/>
+              <w:spacing w:line="360" w:lineRule="auto"/>
               <w:rPr>
                 <w:rFonts w:hint="eastAsia" w:ascii="宋体" w:hAnsi="宋体" w:eastAsia="宋体" w:cs="宋体"/>
                 <w:color w:val="000000" w:themeColor="text1"/>
@@ -2546,6 +2612,7 @@
           <w:p>
             <w:pPr>
               <w:pStyle w:val="24"/>
+              <w:spacing w:line="360" w:lineRule="auto"/>
               <w:rPr>
                 <w:rFonts w:hint="eastAsia" w:ascii="宋体" w:hAnsi="宋体" w:eastAsia="宋体" w:cs="宋体"/>
                 <w:color w:val="000000" w:themeColor="text1"/>
@@ -2578,6 +2645,7 @@
           <w:p>
             <w:pPr>
               <w:pStyle w:val="24"/>
+              <w:spacing w:line="360" w:lineRule="auto"/>
               <w:rPr>
                 <w:rFonts w:hint="eastAsia" w:ascii="宋体" w:hAnsi="宋体" w:eastAsia="宋体" w:cs="宋体"/>
                 <w:color w:val="000000" w:themeColor="text1"/>
@@ -2610,6 +2678,7 @@
           <w:p>
             <w:pPr>
               <w:pStyle w:val="24"/>
+              <w:spacing w:line="360" w:lineRule="auto"/>
               <w:jc w:val="right"/>
               <w:rPr>
                 <w:rFonts w:hint="eastAsia" w:ascii="宋体" w:hAnsi="宋体" w:eastAsia="宋体" w:cs="宋体"/>
@@ -2643,6 +2712,7 @@
           <w:p>
             <w:pPr>
               <w:pStyle w:val="24"/>
+              <w:spacing w:line="360" w:lineRule="auto"/>
               <w:rPr>
                 <w:rFonts w:hint="eastAsia" w:ascii="宋体" w:hAnsi="宋体" w:eastAsia="宋体" w:cs="宋体"/>
                 <w:color w:val="000000" w:themeColor="text1"/>
@@ -2675,6 +2745,7 @@
           <w:p>
             <w:pPr>
               <w:pStyle w:val="24"/>
+              <w:spacing w:line="360" w:lineRule="auto"/>
               <w:rPr>
                 <w:rFonts w:hint="eastAsia" w:ascii="宋体" w:hAnsi="宋体" w:eastAsia="宋体" w:cs="宋体"/>
                 <w:color w:val="000000" w:themeColor="text1"/>
@@ -2707,6 +2778,7 @@
           <w:p>
             <w:pPr>
               <w:pStyle w:val="24"/>
+              <w:spacing w:line="360" w:lineRule="auto"/>
               <w:rPr>
                 <w:rFonts w:hint="eastAsia" w:ascii="宋体" w:hAnsi="宋体" w:eastAsia="宋体" w:cs="宋体"/>
                 <w:color w:val="000000" w:themeColor="text1"/>
@@ -2741,6 +2813,7 @@
     <w:p>
       <w:pPr>
         <w:pStyle w:val="4"/>
+        <w:spacing w:line="360" w:lineRule="auto"/>
         <w:rPr>
           <w:rFonts w:hint="eastAsia" w:ascii="宋体" w:hAnsi="宋体" w:eastAsia="宋体" w:cs="宋体"/>
           <w:color w:val="000000" w:themeColor="text1"/>
@@ -2814,6 +2887,7 @@
     <w:p>
       <w:pPr>
         <w:pStyle w:val="5"/>
+        <w:spacing w:line="360" w:lineRule="auto"/>
         <w:rPr>
           <w:rFonts w:hint="eastAsia" w:ascii="宋体" w:hAnsi="宋体" w:eastAsia="宋体" w:cs="宋体"/>
           <w:color w:val="000000" w:themeColor="text1"/>
@@ -2859,6 +2933,8 @@
     <w:p>
       <w:pPr>
         <w:pStyle w:val="23"/>
+        <w:spacing w:line="360" w:lineRule="auto"/>
+        <w:ind w:firstLine="480" w:firstLineChars="200"/>
         <w:rPr>
           <w:rFonts w:hint="eastAsia" w:ascii="宋体" w:hAnsi="宋体" w:eastAsia="宋体" w:cs="宋体"/>
           <w:color w:val="000000" w:themeColor="text1"/>
@@ -2917,6 +2993,7 @@
     <w:p>
       <w:pPr>
         <w:pStyle w:val="3"/>
+        <w:spacing w:line="360" w:lineRule="auto"/>
         <w:rPr>
           <w:rFonts w:hint="eastAsia" w:ascii="宋体" w:hAnsi="宋体" w:eastAsia="宋体" w:cs="宋体"/>
           <w:color w:val="000000" w:themeColor="text1"/>
@@ -2947,6 +3024,7 @@
     <w:p>
       <w:pPr>
         <w:pStyle w:val="49"/>
+        <w:spacing w:line="360" w:lineRule="auto"/>
         <w:rPr>
           <w:rFonts w:hint="eastAsia" w:ascii="宋体" w:hAnsi="宋体" w:eastAsia="宋体" w:cs="宋体"/>
           <w:color w:val="000000" w:themeColor="text1"/>
@@ -3322,6 +3400,7 @@
     <w:p>
       <w:pPr>
         <w:pStyle w:val="5"/>
+        <w:spacing w:line="360" w:lineRule="auto"/>
         <w:rPr>
           <w:rFonts w:hint="eastAsia" w:ascii="宋体" w:hAnsi="宋体" w:eastAsia="宋体" w:cs="宋体"/>
           <w:color w:val="000000" w:themeColor="text1"/>
@@ -3403,6 +3482,7 @@
           <w:p>
             <w:pPr>
               <w:pStyle w:val="24"/>
+              <w:spacing w:line="360" w:lineRule="auto"/>
               <w:rPr>
                 <w:rFonts w:hint="eastAsia" w:ascii="宋体" w:hAnsi="宋体" w:eastAsia="宋体" w:cs="宋体"/>
                 <w:color w:val="000000" w:themeColor="text1"/>
@@ -3435,6 +3515,7 @@
           <w:p>
             <w:pPr>
               <w:pStyle w:val="24"/>
+              <w:spacing w:line="360" w:lineRule="auto"/>
               <w:jc w:val="right"/>
               <w:rPr>
                 <w:rFonts w:hint="eastAsia" w:ascii="宋体" w:hAnsi="宋体" w:eastAsia="宋体" w:cs="宋体"/>
@@ -3468,6 +3549,7 @@
           <w:p>
             <w:pPr>
               <w:pStyle w:val="24"/>
+              <w:spacing w:line="360" w:lineRule="auto"/>
               <w:jc w:val="right"/>
               <w:rPr>
                 <w:rFonts w:hint="eastAsia" w:ascii="宋体" w:hAnsi="宋体" w:eastAsia="宋体" w:cs="宋体"/>
@@ -3501,6 +3583,7 @@
           <w:p>
             <w:pPr>
               <w:pStyle w:val="24"/>
+              <w:spacing w:line="360" w:lineRule="auto"/>
               <w:jc w:val="right"/>
               <w:rPr>
                 <w:rFonts w:hint="eastAsia" w:ascii="宋体" w:hAnsi="宋体" w:eastAsia="宋体" w:cs="宋体"/>
@@ -3534,6 +3617,7 @@
           <w:p>
             <w:pPr>
               <w:pStyle w:val="24"/>
+              <w:spacing w:line="360" w:lineRule="auto"/>
               <w:jc w:val="right"/>
               <w:rPr>
                 <w:rFonts w:hint="eastAsia" w:ascii="宋体" w:hAnsi="宋体" w:eastAsia="宋体" w:cs="宋体"/>
@@ -3567,6 +3651,7 @@
           <w:p>
             <w:pPr>
               <w:pStyle w:val="24"/>
+              <w:spacing w:line="360" w:lineRule="auto"/>
               <w:jc w:val="right"/>
               <w:rPr>
                 <w:rFonts w:hint="eastAsia" w:ascii="宋体" w:hAnsi="宋体" w:eastAsia="宋体" w:cs="宋体"/>
@@ -3600,6 +3685,7 @@
           <w:p>
             <w:pPr>
               <w:pStyle w:val="24"/>
+              <w:spacing w:line="360" w:lineRule="auto"/>
               <w:jc w:val="right"/>
               <w:rPr>
                 <w:rFonts w:hint="eastAsia" w:ascii="宋体" w:hAnsi="宋体" w:eastAsia="宋体" w:cs="宋体"/>
@@ -3633,6 +3719,7 @@
           <w:p>
             <w:pPr>
               <w:pStyle w:val="24"/>
+              <w:spacing w:line="360" w:lineRule="auto"/>
               <w:jc w:val="right"/>
               <w:rPr>
                 <w:rFonts w:hint="eastAsia" w:ascii="宋体" w:hAnsi="宋体" w:eastAsia="宋体" w:cs="宋体"/>
@@ -3676,6 +3763,7 @@
           <w:p>
             <w:pPr>
               <w:pStyle w:val="24"/>
+              <w:spacing w:line="360" w:lineRule="auto"/>
               <w:rPr>
                 <w:rFonts w:hint="eastAsia" w:ascii="宋体" w:hAnsi="宋体" w:eastAsia="宋体" w:cs="宋体"/>
                 <w:color w:val="000000" w:themeColor="text1"/>
@@ -3708,6 +3796,7 @@
           <w:p>
             <w:pPr>
               <w:pStyle w:val="24"/>
+              <w:spacing w:line="360" w:lineRule="auto"/>
               <w:jc w:val="right"/>
               <w:rPr>
                 <w:rFonts w:hint="eastAsia" w:ascii="宋体" w:hAnsi="宋体" w:eastAsia="宋体" w:cs="宋体"/>
@@ -3741,6 +3830,7 @@
           <w:p>
             <w:pPr>
               <w:pStyle w:val="24"/>
+              <w:spacing w:line="360" w:lineRule="auto"/>
               <w:jc w:val="right"/>
               <w:rPr>
                 <w:rFonts w:hint="eastAsia" w:ascii="宋体" w:hAnsi="宋体" w:eastAsia="宋体" w:cs="宋体"/>
@@ -3774,6 +3864,7 @@
           <w:p>
             <w:pPr>
               <w:pStyle w:val="24"/>
+              <w:spacing w:line="360" w:lineRule="auto"/>
               <w:jc w:val="right"/>
               <w:rPr>
                 <w:rFonts w:hint="eastAsia" w:ascii="宋体" w:hAnsi="宋体" w:eastAsia="宋体" w:cs="宋体"/>
@@ -3807,6 +3898,7 @@
           <w:p>
             <w:pPr>
               <w:pStyle w:val="24"/>
+              <w:spacing w:line="360" w:lineRule="auto"/>
               <w:jc w:val="right"/>
               <w:rPr>
                 <w:rFonts w:hint="eastAsia" w:ascii="宋体" w:hAnsi="宋体" w:eastAsia="宋体" w:cs="宋体"/>
@@ -3840,6 +3932,7 @@
           <w:p>
             <w:pPr>
               <w:pStyle w:val="24"/>
+              <w:spacing w:line="360" w:lineRule="auto"/>
               <w:jc w:val="right"/>
               <w:rPr>
                 <w:rFonts w:hint="eastAsia" w:ascii="宋体" w:hAnsi="宋体" w:eastAsia="宋体" w:cs="宋体"/>
@@ -3873,6 +3966,7 @@
           <w:p>
             <w:pPr>
               <w:pStyle w:val="24"/>
+              <w:spacing w:line="360" w:lineRule="auto"/>
               <w:jc w:val="right"/>
               <w:rPr>
                 <w:rFonts w:hint="eastAsia" w:ascii="宋体" w:hAnsi="宋体" w:eastAsia="宋体" w:cs="宋体"/>
@@ -3906,6 +4000,7 @@
           <w:p>
             <w:pPr>
               <w:pStyle w:val="24"/>
+              <w:spacing w:line="360" w:lineRule="auto"/>
               <w:jc w:val="right"/>
               <w:rPr>
                 <w:rFonts w:hint="eastAsia" w:ascii="宋体" w:hAnsi="宋体" w:eastAsia="宋体" w:cs="宋体"/>
@@ -3949,6 +4044,7 @@
           <w:p>
             <w:pPr>
               <w:pStyle w:val="24"/>
+              <w:spacing w:line="360" w:lineRule="auto"/>
               <w:rPr>
                 <w:rFonts w:hint="eastAsia" w:ascii="宋体" w:hAnsi="宋体" w:eastAsia="宋体" w:cs="宋体"/>
                 <w:color w:val="000000" w:themeColor="text1"/>
@@ -3981,6 +4077,7 @@
           <w:p>
             <w:pPr>
               <w:pStyle w:val="24"/>
+              <w:spacing w:line="360" w:lineRule="auto"/>
               <w:jc w:val="right"/>
               <w:rPr>
                 <w:rFonts w:hint="eastAsia" w:ascii="宋体" w:hAnsi="宋体" w:eastAsia="宋体" w:cs="宋体"/>
@@ -4014,6 +4111,7 @@
           <w:p>
             <w:pPr>
               <w:pStyle w:val="24"/>
+              <w:spacing w:line="360" w:lineRule="auto"/>
               <w:jc w:val="right"/>
               <w:rPr>
                 <w:rFonts w:hint="eastAsia" w:ascii="宋体" w:hAnsi="宋体" w:eastAsia="宋体" w:cs="宋体"/>
@@ -4047,6 +4145,7 @@
           <w:p>
             <w:pPr>
               <w:pStyle w:val="24"/>
+              <w:spacing w:line="360" w:lineRule="auto"/>
               <w:jc w:val="right"/>
               <w:rPr>
                 <w:rFonts w:hint="eastAsia" w:ascii="宋体" w:hAnsi="宋体" w:eastAsia="宋体" w:cs="宋体"/>
@@ -4080,6 +4179,7 @@
           <w:p>
             <w:pPr>
               <w:pStyle w:val="24"/>
+              <w:spacing w:line="360" w:lineRule="auto"/>
               <w:jc w:val="right"/>
               <w:rPr>
                 <w:rFonts w:hint="eastAsia" w:ascii="宋体" w:hAnsi="宋体" w:eastAsia="宋体" w:cs="宋体"/>
@@ -4113,6 +4213,7 @@
           <w:p>
             <w:pPr>
               <w:pStyle w:val="24"/>
+              <w:spacing w:line="360" w:lineRule="auto"/>
               <w:jc w:val="right"/>
               <w:rPr>
                 <w:rFonts w:hint="eastAsia" w:ascii="宋体" w:hAnsi="宋体" w:eastAsia="宋体" w:cs="宋体"/>
@@ -4146,6 +4247,7 @@
           <w:p>
             <w:pPr>
               <w:pStyle w:val="24"/>
+              <w:spacing w:line="360" w:lineRule="auto"/>
               <w:jc w:val="right"/>
               <w:rPr>
                 <w:rFonts w:hint="eastAsia" w:ascii="宋体" w:hAnsi="宋体" w:eastAsia="宋体" w:cs="宋体"/>
@@ -4179,6 +4281,7 @@
           <w:p>
             <w:pPr>
               <w:pStyle w:val="24"/>
+              <w:spacing w:line="360" w:lineRule="auto"/>
               <w:jc w:val="right"/>
               <w:rPr>
                 <w:rFonts w:hint="eastAsia" w:ascii="宋体" w:hAnsi="宋体" w:eastAsia="宋体" w:cs="宋体"/>
@@ -4222,6 +4325,7 @@
           <w:p>
             <w:pPr>
               <w:pStyle w:val="24"/>
+              <w:spacing w:line="360" w:lineRule="auto"/>
               <w:rPr>
                 <w:rFonts w:hint="eastAsia" w:ascii="宋体" w:hAnsi="宋体" w:eastAsia="宋体" w:cs="宋体"/>
                 <w:color w:val="000000" w:themeColor="text1"/>
@@ -4254,6 +4358,7 @@
           <w:p>
             <w:pPr>
               <w:pStyle w:val="24"/>
+              <w:spacing w:line="360" w:lineRule="auto"/>
               <w:jc w:val="right"/>
               <w:rPr>
                 <w:rFonts w:hint="eastAsia" w:ascii="宋体" w:hAnsi="宋体" w:eastAsia="宋体" w:cs="宋体"/>
@@ -4287,6 +4392,7 @@
           <w:p>
             <w:pPr>
               <w:pStyle w:val="24"/>
+              <w:spacing w:line="360" w:lineRule="auto"/>
               <w:jc w:val="right"/>
               <w:rPr>
                 <w:rFonts w:hint="eastAsia" w:ascii="宋体" w:hAnsi="宋体" w:eastAsia="宋体" w:cs="宋体"/>
@@ -4320,6 +4426,7 @@
           <w:p>
             <w:pPr>
               <w:pStyle w:val="24"/>
+              <w:spacing w:line="360" w:lineRule="auto"/>
               <w:jc w:val="right"/>
               <w:rPr>
                 <w:rFonts w:hint="eastAsia" w:ascii="宋体" w:hAnsi="宋体" w:eastAsia="宋体" w:cs="宋体"/>
@@ -4353,6 +4460,7 @@
           <w:p>
             <w:pPr>
               <w:pStyle w:val="24"/>
+              <w:spacing w:line="360" w:lineRule="auto"/>
               <w:jc w:val="right"/>
               <w:rPr>
                 <w:rFonts w:hint="eastAsia" w:ascii="宋体" w:hAnsi="宋体" w:eastAsia="宋体" w:cs="宋体"/>
@@ -4386,6 +4494,7 @@
           <w:p>
             <w:pPr>
               <w:pStyle w:val="24"/>
+              <w:spacing w:line="360" w:lineRule="auto"/>
               <w:jc w:val="right"/>
               <w:rPr>
                 <w:rFonts w:hint="eastAsia" w:ascii="宋体" w:hAnsi="宋体" w:eastAsia="宋体" w:cs="宋体"/>
@@ -4419,6 +4528,7 @@
           <w:p>
             <w:pPr>
               <w:pStyle w:val="24"/>
+              <w:spacing w:line="360" w:lineRule="auto"/>
               <w:jc w:val="right"/>
               <w:rPr>
                 <w:rFonts w:hint="eastAsia" w:ascii="宋体" w:hAnsi="宋体" w:eastAsia="宋体" w:cs="宋体"/>
@@ -4452,6 +4562,7 @@
           <w:p>
             <w:pPr>
               <w:pStyle w:val="24"/>
+              <w:spacing w:line="360" w:lineRule="auto"/>
               <w:jc w:val="right"/>
               <w:rPr>
                 <w:rFonts w:hint="eastAsia" w:ascii="宋体" w:hAnsi="宋体" w:eastAsia="宋体" w:cs="宋体"/>
@@ -4495,6 +4606,7 @@
           <w:p>
             <w:pPr>
               <w:pStyle w:val="24"/>
+              <w:spacing w:line="360" w:lineRule="auto"/>
               <w:rPr>
                 <w:rFonts w:hint="eastAsia" w:ascii="宋体" w:hAnsi="宋体" w:eastAsia="宋体" w:cs="宋体"/>
                 <w:color w:val="000000" w:themeColor="text1"/>
@@ -4527,6 +4639,7 @@
           <w:p>
             <w:pPr>
               <w:pStyle w:val="24"/>
+              <w:spacing w:line="360" w:lineRule="auto"/>
               <w:jc w:val="right"/>
               <w:rPr>
                 <w:rFonts w:hint="eastAsia" w:ascii="宋体" w:hAnsi="宋体" w:eastAsia="宋体" w:cs="宋体"/>
@@ -4560,6 +4673,7 @@
           <w:p>
             <w:pPr>
               <w:pStyle w:val="24"/>
+              <w:spacing w:line="360" w:lineRule="auto"/>
               <w:jc w:val="right"/>
               <w:rPr>
                 <w:rFonts w:hint="eastAsia" w:ascii="宋体" w:hAnsi="宋体" w:eastAsia="宋体" w:cs="宋体"/>
@@ -4593,6 +4707,7 @@
           <w:p>
             <w:pPr>
               <w:pStyle w:val="24"/>
+              <w:spacing w:line="360" w:lineRule="auto"/>
               <w:jc w:val="right"/>
               <w:rPr>
                 <w:rFonts w:hint="eastAsia" w:ascii="宋体" w:hAnsi="宋体" w:eastAsia="宋体" w:cs="宋体"/>
@@ -4626,6 +4741,7 @@
           <w:p>
             <w:pPr>
               <w:pStyle w:val="24"/>
+              <w:spacing w:line="360" w:lineRule="auto"/>
               <w:jc w:val="right"/>
               <w:rPr>
                 <w:rFonts w:hint="eastAsia" w:ascii="宋体" w:hAnsi="宋体" w:eastAsia="宋体" w:cs="宋体"/>
@@ -4659,6 +4775,7 @@
           <w:p>
             <w:pPr>
               <w:pStyle w:val="24"/>
+              <w:spacing w:line="360" w:lineRule="auto"/>
               <w:jc w:val="right"/>
               <w:rPr>
                 <w:rFonts w:hint="eastAsia" w:ascii="宋体" w:hAnsi="宋体" w:eastAsia="宋体" w:cs="宋体"/>
@@ -4692,6 +4809,7 @@
           <w:p>
             <w:pPr>
               <w:pStyle w:val="24"/>
+              <w:spacing w:line="360" w:lineRule="auto"/>
               <w:jc w:val="right"/>
               <w:rPr>
                 <w:rFonts w:hint="eastAsia" w:ascii="宋体" w:hAnsi="宋体" w:eastAsia="宋体" w:cs="宋体"/>
@@ -4725,6 +4843,7 @@
           <w:p>
             <w:pPr>
               <w:pStyle w:val="24"/>
+              <w:spacing w:line="360" w:lineRule="auto"/>
               <w:jc w:val="right"/>
               <w:rPr>
                 <w:rFonts w:hint="eastAsia" w:ascii="宋体" w:hAnsi="宋体" w:eastAsia="宋体" w:cs="宋体"/>
@@ -4768,6 +4887,7 @@
           <w:p>
             <w:pPr>
               <w:pStyle w:val="24"/>
+              <w:spacing w:line="360" w:lineRule="auto"/>
               <w:rPr>
                 <w:rFonts w:hint="eastAsia" w:ascii="宋体" w:hAnsi="宋体" w:eastAsia="宋体" w:cs="宋体"/>
                 <w:color w:val="000000" w:themeColor="text1"/>
@@ -4800,6 +4920,7 @@
           <w:p>
             <w:pPr>
               <w:pStyle w:val="24"/>
+              <w:spacing w:line="360" w:lineRule="auto"/>
               <w:jc w:val="right"/>
               <w:rPr>
                 <w:rFonts w:hint="eastAsia" w:ascii="宋体" w:hAnsi="宋体" w:eastAsia="宋体" w:cs="宋体"/>
@@ -4833,6 +4954,7 @@
           <w:p>
             <w:pPr>
               <w:pStyle w:val="24"/>
+              <w:spacing w:line="360" w:lineRule="auto"/>
               <w:jc w:val="right"/>
               <w:rPr>
                 <w:rFonts w:hint="eastAsia" w:ascii="宋体" w:hAnsi="宋体" w:eastAsia="宋体" w:cs="宋体"/>
@@ -4866,6 +4988,7 @@
           <w:p>
             <w:pPr>
               <w:pStyle w:val="24"/>
+              <w:spacing w:line="360" w:lineRule="auto"/>
               <w:jc w:val="right"/>
               <w:rPr>
                 <w:rFonts w:hint="eastAsia" w:ascii="宋体" w:hAnsi="宋体" w:eastAsia="宋体" w:cs="宋体"/>
@@ -4899,6 +5022,7 @@
           <w:p>
             <w:pPr>
               <w:pStyle w:val="24"/>
+              <w:spacing w:line="360" w:lineRule="auto"/>
               <w:jc w:val="right"/>
               <w:rPr>
                 <w:rFonts w:hint="eastAsia" w:ascii="宋体" w:hAnsi="宋体" w:eastAsia="宋体" w:cs="宋体"/>
@@ -4932,6 +5056,7 @@
           <w:p>
             <w:pPr>
               <w:pStyle w:val="24"/>
+              <w:spacing w:line="360" w:lineRule="auto"/>
               <w:jc w:val="right"/>
               <w:rPr>
                 <w:rFonts w:hint="eastAsia" w:ascii="宋体" w:hAnsi="宋体" w:eastAsia="宋体" w:cs="宋体"/>
@@ -4965,6 +5090,7 @@
           <w:p>
             <w:pPr>
               <w:pStyle w:val="24"/>
+              <w:spacing w:line="360" w:lineRule="auto"/>
               <w:jc w:val="right"/>
               <w:rPr>
                 <w:rFonts w:hint="eastAsia" w:ascii="宋体" w:hAnsi="宋体" w:eastAsia="宋体" w:cs="宋体"/>
@@ -4998,6 +5124,7 @@
           <w:p>
             <w:pPr>
               <w:pStyle w:val="24"/>
+              <w:spacing w:line="360" w:lineRule="auto"/>
               <w:jc w:val="right"/>
               <w:rPr>
                 <w:rFonts w:hint="eastAsia" w:ascii="宋体" w:hAnsi="宋体" w:eastAsia="宋体" w:cs="宋体"/>
@@ -5041,6 +5168,7 @@
           <w:p>
             <w:pPr>
               <w:pStyle w:val="24"/>
+              <w:spacing w:line="360" w:lineRule="auto"/>
               <w:rPr>
                 <w:rFonts w:hint="eastAsia" w:ascii="宋体" w:hAnsi="宋体" w:eastAsia="宋体" w:cs="宋体"/>
                 <w:color w:val="000000" w:themeColor="text1"/>
@@ -5075,6 +5203,7 @@
           <w:p>
             <w:pPr>
               <w:pStyle w:val="24"/>
+              <w:spacing w:line="360" w:lineRule="auto"/>
               <w:jc w:val="right"/>
               <w:rPr>
                 <w:rFonts w:hint="eastAsia" w:ascii="宋体" w:hAnsi="宋体" w:eastAsia="宋体" w:cs="宋体"/>
@@ -5110,6 +5239,7 @@
           <w:p>
             <w:pPr>
               <w:pStyle w:val="24"/>
+              <w:spacing w:line="360" w:lineRule="auto"/>
               <w:jc w:val="right"/>
               <w:rPr>
                 <w:rFonts w:hint="eastAsia" w:ascii="宋体" w:hAnsi="宋体" w:eastAsia="宋体" w:cs="宋体"/>
@@ -5145,6 +5275,7 @@
           <w:p>
             <w:pPr>
               <w:pStyle w:val="24"/>
+              <w:spacing w:line="360" w:lineRule="auto"/>
               <w:jc w:val="right"/>
               <w:rPr>
                 <w:rFonts w:hint="eastAsia" w:ascii="宋体" w:hAnsi="宋体" w:eastAsia="宋体" w:cs="宋体"/>
@@ -5180,6 +5311,7 @@
           <w:p>
             <w:pPr>
               <w:pStyle w:val="24"/>
+              <w:spacing w:line="360" w:lineRule="auto"/>
               <w:jc w:val="right"/>
               <w:rPr>
                 <w:rFonts w:hint="eastAsia" w:ascii="宋体" w:hAnsi="宋体" w:eastAsia="宋体" w:cs="宋体"/>
@@ -5215,6 +5347,7 @@
           <w:p>
             <w:pPr>
               <w:pStyle w:val="24"/>
+              <w:spacing w:line="360" w:lineRule="auto"/>
               <w:jc w:val="right"/>
               <w:rPr>
                 <w:rFonts w:hint="eastAsia" w:ascii="宋体" w:hAnsi="宋体" w:eastAsia="宋体" w:cs="宋体"/>
@@ -5250,6 +5383,7 @@
           <w:p>
             <w:pPr>
               <w:pStyle w:val="24"/>
+              <w:spacing w:line="360" w:lineRule="auto"/>
               <w:jc w:val="right"/>
               <w:rPr>
                 <w:rFonts w:hint="eastAsia" w:ascii="宋体" w:hAnsi="宋体" w:eastAsia="宋体" w:cs="宋体"/>
@@ -5285,6 +5419,7 @@
           <w:p>
             <w:pPr>
               <w:pStyle w:val="24"/>
+              <w:spacing w:line="360" w:lineRule="auto"/>
               <w:jc w:val="right"/>
               <w:rPr>
                 <w:rFonts w:hint="eastAsia" w:ascii="宋体" w:hAnsi="宋体" w:eastAsia="宋体" w:cs="宋体"/>
@@ -5322,6 +5457,7 @@
     <w:p>
       <w:pPr>
         <w:pStyle w:val="5"/>
+        <w:spacing w:line="360" w:lineRule="auto"/>
         <w:rPr>
           <w:rFonts w:hint="eastAsia" w:ascii="宋体" w:hAnsi="宋体" w:eastAsia="宋体" w:cs="宋体"/>
           <w:color w:val="000000" w:themeColor="text1"/>
@@ -5367,6 +5503,8 @@
     <w:p>
       <w:pPr>
         <w:pStyle w:val="23"/>
+        <w:spacing w:line="360" w:lineRule="auto"/>
+        <w:ind w:firstLine="480" w:firstLineChars="200"/>
         <w:rPr>
           <w:rFonts w:hint="eastAsia" w:ascii="宋体" w:hAnsi="宋体" w:eastAsia="宋体" w:cs="宋体"/>
           <w:color w:val="000000" w:themeColor="text1"/>
@@ -5541,6 +5679,8 @@
     <w:p>
       <w:pPr>
         <w:pStyle w:val="3"/>
+        <w:spacing w:line="360" w:lineRule="auto"/>
+        <w:ind w:firstLine="480" w:firstLineChars="200"/>
         <w:rPr>
           <w:rFonts w:hint="eastAsia" w:ascii="宋体" w:hAnsi="宋体" w:eastAsia="宋体" w:cs="宋体"/>
           <w:color w:val="000000" w:themeColor="text1"/>
@@ -5685,6 +5825,7 @@
     <w:p>
       <w:pPr>
         <w:pStyle w:val="4"/>
+        <w:spacing w:line="360" w:lineRule="auto"/>
         <w:rPr>
           <w:rFonts w:hint="eastAsia" w:ascii="宋体" w:hAnsi="宋体" w:eastAsia="宋体" w:cs="宋体"/>
           <w:color w:val="000000" w:themeColor="text1"/>
@@ -5758,6 +5899,7 @@
     <w:p>
       <w:pPr>
         <w:pStyle w:val="5"/>
+        <w:spacing w:line="360" w:lineRule="auto"/>
         <w:rPr>
           <w:rFonts w:hint="eastAsia" w:ascii="宋体" w:hAnsi="宋体" w:eastAsia="宋体" w:cs="宋体"/>
           <w:color w:val="000000" w:themeColor="text1"/>
@@ -5803,6 +5945,8 @@
     <w:p>
       <w:pPr>
         <w:pStyle w:val="23"/>
+        <w:spacing w:line="360" w:lineRule="auto"/>
+        <w:ind w:firstLine="480" w:firstLineChars="200"/>
         <w:rPr>
           <w:rFonts w:hint="eastAsia" w:ascii="宋体" w:hAnsi="宋体" w:eastAsia="宋体" w:cs="宋体"/>
           <w:color w:val="000000" w:themeColor="text1"/>
@@ -5889,6 +6033,7 @@
     <w:p>
       <w:pPr>
         <w:pStyle w:val="3"/>
+        <w:spacing w:line="360" w:lineRule="auto"/>
         <w:rPr>
           <w:rFonts w:hint="eastAsia" w:ascii="宋体" w:hAnsi="宋体" w:eastAsia="宋体" w:cs="宋体"/>
           <w:color w:val="000000" w:themeColor="text1"/>
@@ -5919,6 +6064,7 @@
     <w:p>
       <w:pPr>
         <w:pStyle w:val="49"/>
+        <w:spacing w:line="360" w:lineRule="auto"/>
         <w:rPr>
           <w:rFonts w:hint="eastAsia" w:ascii="宋体" w:hAnsi="宋体" w:eastAsia="宋体" w:cs="宋体"/>
           <w:color w:val="000000" w:themeColor="text1"/>
@@ -6130,6 +6276,7 @@
     <w:p>
       <w:pPr>
         <w:pStyle w:val="5"/>
+        <w:spacing w:line="360" w:lineRule="auto"/>
         <w:rPr>
           <w:rFonts w:hint="eastAsia" w:ascii="宋体" w:hAnsi="宋体" w:eastAsia="宋体" w:cs="宋体"/>
           <w:color w:val="000000" w:themeColor="text1"/>
@@ -6209,6 +6356,7 @@
           <w:p>
             <w:pPr>
               <w:pStyle w:val="24"/>
+              <w:spacing w:line="360" w:lineRule="auto"/>
               <w:rPr>
                 <w:rFonts w:hint="eastAsia" w:ascii="宋体" w:hAnsi="宋体" w:eastAsia="宋体" w:cs="宋体"/>
                 <w:color w:val="000000" w:themeColor="text1"/>
@@ -6241,6 +6389,7 @@
           <w:p>
             <w:pPr>
               <w:pStyle w:val="24"/>
+              <w:spacing w:line="360" w:lineRule="auto"/>
               <w:jc w:val="right"/>
               <w:rPr>
                 <w:rFonts w:hint="eastAsia" w:ascii="宋体" w:hAnsi="宋体" w:eastAsia="宋体" w:cs="宋体"/>
@@ -6274,6 +6423,7 @@
           <w:p>
             <w:pPr>
               <w:pStyle w:val="24"/>
+              <w:spacing w:line="360" w:lineRule="auto"/>
               <w:jc w:val="right"/>
               <w:rPr>
                 <w:rFonts w:hint="eastAsia" w:ascii="宋体" w:hAnsi="宋体" w:eastAsia="宋体" w:cs="宋体"/>
@@ -6307,6 +6457,7 @@
           <w:p>
             <w:pPr>
               <w:pStyle w:val="24"/>
+              <w:spacing w:line="360" w:lineRule="auto"/>
               <w:jc w:val="right"/>
               <w:rPr>
                 <w:rFonts w:hint="eastAsia" w:ascii="宋体" w:hAnsi="宋体" w:eastAsia="宋体" w:cs="宋体"/>
@@ -6340,6 +6491,7 @@
           <w:p>
             <w:pPr>
               <w:pStyle w:val="24"/>
+              <w:spacing w:line="360" w:lineRule="auto"/>
               <w:jc w:val="right"/>
               <w:rPr>
                 <w:rFonts w:hint="eastAsia" w:ascii="宋体" w:hAnsi="宋体" w:eastAsia="宋体" w:cs="宋体"/>
@@ -6373,6 +6525,7 @@
           <w:p>
             <w:pPr>
               <w:pStyle w:val="24"/>
+              <w:spacing w:line="360" w:lineRule="auto"/>
               <w:rPr>
                 <w:rFonts w:hint="eastAsia" w:ascii="宋体" w:hAnsi="宋体" w:eastAsia="宋体" w:cs="宋体"/>
                 <w:color w:val="000000" w:themeColor="text1"/>
@@ -6443,6 +6596,7 @@
           <w:p>
             <w:pPr>
               <w:pStyle w:val="24"/>
+              <w:spacing w:line="360" w:lineRule="auto"/>
               <w:rPr>
                 <w:rFonts w:hint="eastAsia" w:ascii="宋体" w:hAnsi="宋体" w:eastAsia="宋体" w:cs="宋体"/>
                 <w:color w:val="000000" w:themeColor="text1"/>
@@ -6475,6 +6629,7 @@
           <w:p>
             <w:pPr>
               <w:pStyle w:val="24"/>
+              <w:spacing w:line="360" w:lineRule="auto"/>
               <w:jc w:val="right"/>
               <w:rPr>
                 <w:rFonts w:hint="eastAsia" w:ascii="宋体" w:hAnsi="宋体" w:eastAsia="宋体" w:cs="宋体"/>
@@ -6508,6 +6663,7 @@
           <w:p>
             <w:pPr>
               <w:pStyle w:val="24"/>
+              <w:spacing w:line="360" w:lineRule="auto"/>
               <w:jc w:val="right"/>
               <w:rPr>
                 <w:rFonts w:hint="eastAsia" w:ascii="宋体" w:hAnsi="宋体" w:eastAsia="宋体" w:cs="宋体"/>
@@ -6541,6 +6697,7 @@
           <w:p>
             <w:pPr>
               <w:pStyle w:val="24"/>
+              <w:spacing w:line="360" w:lineRule="auto"/>
               <w:jc w:val="right"/>
               <w:rPr>
                 <w:rFonts w:hint="eastAsia" w:ascii="宋体" w:hAnsi="宋体" w:eastAsia="宋体" w:cs="宋体"/>
@@ -6574,6 +6731,7 @@
           <w:p>
             <w:pPr>
               <w:pStyle w:val="24"/>
+              <w:spacing w:line="360" w:lineRule="auto"/>
               <w:jc w:val="right"/>
               <w:rPr>
                 <w:rFonts w:hint="eastAsia" w:ascii="宋体" w:hAnsi="宋体" w:eastAsia="宋体" w:cs="宋体"/>
@@ -6607,6 +6765,7 @@
           <w:p>
             <w:pPr>
               <w:pStyle w:val="24"/>
+              <w:spacing w:line="360" w:lineRule="auto"/>
               <w:rPr>
                 <w:rFonts w:hint="eastAsia" w:ascii="宋体" w:hAnsi="宋体" w:eastAsia="宋体" w:cs="宋体"/>
                 <w:color w:val="000000" w:themeColor="text1"/>
@@ -6649,6 +6808,7 @@
           <w:p>
             <w:pPr>
               <w:pStyle w:val="24"/>
+              <w:spacing w:line="360" w:lineRule="auto"/>
               <w:rPr>
                 <w:rFonts w:hint="eastAsia" w:ascii="宋体" w:hAnsi="宋体" w:eastAsia="宋体" w:cs="宋体"/>
                 <w:color w:val="000000" w:themeColor="text1"/>
@@ -6681,6 +6841,7 @@
           <w:p>
             <w:pPr>
               <w:pStyle w:val="24"/>
+              <w:spacing w:line="360" w:lineRule="auto"/>
               <w:jc w:val="right"/>
               <w:rPr>
                 <w:rFonts w:hint="eastAsia" w:ascii="宋体" w:hAnsi="宋体" w:eastAsia="宋体" w:cs="宋体"/>
@@ -6714,6 +6875,7 @@
           <w:p>
             <w:pPr>
               <w:pStyle w:val="24"/>
+              <w:spacing w:line="360" w:lineRule="auto"/>
               <w:jc w:val="right"/>
               <w:rPr>
                 <w:rFonts w:hint="eastAsia" w:ascii="宋体" w:hAnsi="宋体" w:eastAsia="宋体" w:cs="宋体"/>
@@ -6747,6 +6909,7 @@
           <w:p>
             <w:pPr>
               <w:pStyle w:val="24"/>
+              <w:spacing w:line="360" w:lineRule="auto"/>
               <w:jc w:val="right"/>
               <w:rPr>
                 <w:rFonts w:hint="eastAsia" w:ascii="宋体" w:hAnsi="宋体" w:eastAsia="宋体" w:cs="宋体"/>
@@ -6780,6 +6943,7 @@
           <w:p>
             <w:pPr>
               <w:pStyle w:val="24"/>
+              <w:spacing w:line="360" w:lineRule="auto"/>
               <w:jc w:val="right"/>
               <w:rPr>
                 <w:rFonts w:hint="eastAsia" w:ascii="宋体" w:hAnsi="宋体" w:eastAsia="宋体" w:cs="宋体"/>
@@ -6813,6 +6977,7 @@
           <w:p>
             <w:pPr>
               <w:pStyle w:val="24"/>
+              <w:spacing w:line="360" w:lineRule="auto"/>
               <w:rPr>
                 <w:rFonts w:hint="eastAsia" w:ascii="宋体" w:hAnsi="宋体" w:eastAsia="宋体" w:cs="宋体"/>
                 <w:color w:val="000000" w:themeColor="text1"/>
@@ -6855,6 +7020,7 @@
           <w:p>
             <w:pPr>
               <w:pStyle w:val="24"/>
+              <w:spacing w:line="360" w:lineRule="auto"/>
               <w:rPr>
                 <w:rFonts w:hint="eastAsia" w:ascii="宋体" w:hAnsi="宋体" w:eastAsia="宋体" w:cs="宋体"/>
                 <w:color w:val="000000" w:themeColor="text1"/>
@@ -6887,6 +7053,7 @@
           <w:p>
             <w:pPr>
               <w:pStyle w:val="24"/>
+              <w:spacing w:line="360" w:lineRule="auto"/>
               <w:jc w:val="right"/>
               <w:rPr>
                 <w:rFonts w:hint="eastAsia" w:ascii="宋体" w:hAnsi="宋体" w:eastAsia="宋体" w:cs="宋体"/>
@@ -6920,6 +7087,7 @@
           <w:p>
             <w:pPr>
               <w:pStyle w:val="24"/>
+              <w:spacing w:line="360" w:lineRule="auto"/>
               <w:jc w:val="right"/>
               <w:rPr>
                 <w:rFonts w:hint="eastAsia" w:ascii="宋体" w:hAnsi="宋体" w:eastAsia="宋体" w:cs="宋体"/>
@@ -6953,6 +7121,7 @@
           <w:p>
             <w:pPr>
               <w:pStyle w:val="24"/>
+              <w:spacing w:line="360" w:lineRule="auto"/>
               <w:jc w:val="right"/>
               <w:rPr>
                 <w:rFonts w:hint="eastAsia" w:ascii="宋体" w:hAnsi="宋体" w:eastAsia="宋体" w:cs="宋体"/>
@@ -6986,6 +7155,7 @@
           <w:p>
             <w:pPr>
               <w:pStyle w:val="24"/>
+              <w:spacing w:line="360" w:lineRule="auto"/>
               <w:jc w:val="right"/>
               <w:rPr>
                 <w:rFonts w:hint="eastAsia" w:ascii="宋体" w:hAnsi="宋体" w:eastAsia="宋体" w:cs="宋体"/>
@@ -7019,6 +7189,7 @@
           <w:p>
             <w:pPr>
               <w:pStyle w:val="24"/>
+              <w:spacing w:line="360" w:lineRule="auto"/>
               <w:rPr>
                 <w:rFonts w:hint="eastAsia" w:ascii="宋体" w:hAnsi="宋体" w:eastAsia="宋体" w:cs="宋体"/>
                 <w:color w:val="000000" w:themeColor="text1"/>
@@ -7061,6 +7232,7 @@
           <w:p>
             <w:pPr>
               <w:pStyle w:val="24"/>
+              <w:spacing w:line="360" w:lineRule="auto"/>
               <w:rPr>
                 <w:rFonts w:hint="eastAsia" w:ascii="宋体" w:hAnsi="宋体" w:eastAsia="宋体" w:cs="宋体"/>
                 <w:color w:val="000000" w:themeColor="text1"/>
@@ -7093,6 +7265,7 @@
           <w:p>
             <w:pPr>
               <w:pStyle w:val="24"/>
+              <w:spacing w:line="360" w:lineRule="auto"/>
               <w:jc w:val="right"/>
               <w:rPr>
                 <w:rFonts w:hint="eastAsia" w:ascii="宋体" w:hAnsi="宋体" w:eastAsia="宋体" w:cs="宋体"/>
@@ -7126,6 +7299,7 @@
           <w:p>
             <w:pPr>
               <w:pStyle w:val="24"/>
+              <w:spacing w:line="360" w:lineRule="auto"/>
               <w:jc w:val="right"/>
               <w:rPr>
                 <w:rFonts w:hint="eastAsia" w:ascii="宋体" w:hAnsi="宋体" w:eastAsia="宋体" w:cs="宋体"/>
@@ -7159,6 +7333,7 @@
           <w:p>
             <w:pPr>
               <w:pStyle w:val="24"/>
+              <w:spacing w:line="360" w:lineRule="auto"/>
               <w:jc w:val="right"/>
               <w:rPr>
                 <w:rFonts w:hint="eastAsia" w:ascii="宋体" w:hAnsi="宋体" w:eastAsia="宋体" w:cs="宋体"/>
@@ -7192,6 +7367,7 @@
           <w:p>
             <w:pPr>
               <w:pStyle w:val="24"/>
+              <w:spacing w:line="360" w:lineRule="auto"/>
               <w:jc w:val="right"/>
               <w:rPr>
                 <w:rFonts w:hint="eastAsia" w:ascii="宋体" w:hAnsi="宋体" w:eastAsia="宋体" w:cs="宋体"/>
@@ -7225,6 +7401,7 @@
           <w:p>
             <w:pPr>
               <w:pStyle w:val="24"/>
+              <w:spacing w:line="360" w:lineRule="auto"/>
               <w:rPr>
                 <w:rFonts w:hint="eastAsia" w:ascii="宋体" w:hAnsi="宋体" w:eastAsia="宋体" w:cs="宋体"/>
                 <w:color w:val="000000" w:themeColor="text1"/>
@@ -7267,6 +7444,7 @@
           <w:p>
             <w:pPr>
               <w:pStyle w:val="24"/>
+              <w:spacing w:line="360" w:lineRule="auto"/>
               <w:rPr>
                 <w:rFonts w:hint="eastAsia" w:ascii="宋体" w:hAnsi="宋体" w:eastAsia="宋体" w:cs="宋体"/>
                 <w:color w:val="000000" w:themeColor="text1"/>
@@ -7299,6 +7477,7 @@
           <w:p>
             <w:pPr>
               <w:pStyle w:val="24"/>
+              <w:spacing w:line="360" w:lineRule="auto"/>
               <w:jc w:val="right"/>
               <w:rPr>
                 <w:rFonts w:hint="eastAsia" w:ascii="宋体" w:hAnsi="宋体" w:eastAsia="宋体" w:cs="宋体"/>
@@ -7332,6 +7511,7 @@
           <w:p>
             <w:pPr>
               <w:pStyle w:val="24"/>
+              <w:spacing w:line="360" w:lineRule="auto"/>
               <w:jc w:val="right"/>
               <w:rPr>
                 <w:rFonts w:hint="eastAsia" w:ascii="宋体" w:hAnsi="宋体" w:eastAsia="宋体" w:cs="宋体"/>
@@ -7365,6 +7545,7 @@
           <w:p>
             <w:pPr>
               <w:pStyle w:val="24"/>
+              <w:spacing w:line="360" w:lineRule="auto"/>
               <w:jc w:val="right"/>
               <w:rPr>
                 <w:rFonts w:hint="eastAsia" w:ascii="宋体" w:hAnsi="宋体" w:eastAsia="宋体" w:cs="宋体"/>
@@ -7398,6 +7579,7 @@
           <w:p>
             <w:pPr>
               <w:pStyle w:val="24"/>
+              <w:spacing w:line="360" w:lineRule="auto"/>
               <w:jc w:val="right"/>
               <w:rPr>
                 <w:rFonts w:hint="eastAsia" w:ascii="宋体" w:hAnsi="宋体" w:eastAsia="宋体" w:cs="宋体"/>
@@ -7431,6 +7613,7 @@
           <w:p>
             <w:pPr>
               <w:pStyle w:val="24"/>
+              <w:spacing w:line="360" w:lineRule="auto"/>
               <w:rPr>
                 <w:rFonts w:hint="eastAsia" w:ascii="宋体" w:hAnsi="宋体" w:eastAsia="宋体" w:cs="宋体"/>
                 <w:color w:val="000000" w:themeColor="text1"/>
@@ -7473,6 +7656,7 @@
           <w:p>
             <w:pPr>
               <w:pStyle w:val="24"/>
+              <w:spacing w:line="360" w:lineRule="auto"/>
               <w:rPr>
                 <w:rFonts w:hint="eastAsia" w:ascii="宋体" w:hAnsi="宋体" w:eastAsia="宋体" w:cs="宋体"/>
                 <w:color w:val="000000" w:themeColor="text1"/>
@@ -7507,6 +7691,7 @@
           <w:p>
             <w:pPr>
               <w:pStyle w:val="24"/>
+              <w:spacing w:line="360" w:lineRule="auto"/>
               <w:jc w:val="right"/>
               <w:rPr>
                 <w:rFonts w:hint="eastAsia" w:ascii="宋体" w:hAnsi="宋体" w:eastAsia="宋体" w:cs="宋体"/>
@@ -7542,6 +7727,7 @@
           <w:p>
             <w:pPr>
               <w:pStyle w:val="24"/>
+              <w:spacing w:line="360" w:lineRule="auto"/>
               <w:jc w:val="right"/>
               <w:rPr>
                 <w:rFonts w:hint="eastAsia" w:ascii="宋体" w:hAnsi="宋体" w:eastAsia="宋体" w:cs="宋体"/>
@@ -7577,6 +7763,7 @@
           <w:p>
             <w:pPr>
               <w:pStyle w:val="24"/>
+              <w:spacing w:line="360" w:lineRule="auto"/>
               <w:jc w:val="right"/>
               <w:rPr>
                 <w:rFonts w:hint="eastAsia" w:ascii="宋体" w:hAnsi="宋体" w:eastAsia="宋体" w:cs="宋体"/>
@@ -7612,6 +7799,7 @@
           <w:p>
             <w:pPr>
               <w:pStyle w:val="24"/>
+              <w:spacing w:line="360" w:lineRule="auto"/>
               <w:jc w:val="right"/>
               <w:rPr>
                 <w:rFonts w:hint="eastAsia" w:ascii="宋体" w:hAnsi="宋体" w:eastAsia="宋体" w:cs="宋体"/>
@@ -7647,6 +7835,7 @@
           <w:p>
             <w:pPr>
               <w:pStyle w:val="24"/>
+              <w:spacing w:line="360" w:lineRule="auto"/>
               <w:rPr>
                 <w:rFonts w:hint="eastAsia" w:ascii="宋体" w:hAnsi="宋体" w:eastAsia="宋体" w:cs="宋体"/>
                 <w:color w:val="000000" w:themeColor="text1"/>
@@ -7683,6 +7872,7 @@
     <w:p>
       <w:pPr>
         <w:pStyle w:val="5"/>
+        <w:spacing w:line="360" w:lineRule="auto"/>
         <w:rPr>
           <w:rFonts w:hint="eastAsia" w:ascii="宋体" w:hAnsi="宋体" w:eastAsia="宋体" w:cs="宋体"/>
           <w:color w:val="000000" w:themeColor="text1"/>
@@ -7728,6 +7918,8 @@
     <w:p>
       <w:pPr>
         <w:pStyle w:val="23"/>
+        <w:spacing w:line="360" w:lineRule="auto"/>
+        <w:ind w:firstLine="480" w:firstLineChars="200"/>
         <w:rPr>
           <w:rFonts w:hint="eastAsia" w:ascii="宋体" w:hAnsi="宋体" w:eastAsia="宋体" w:cs="宋体"/>
           <w:color w:val="000000" w:themeColor="text1"/>
@@ -7846,6 +8038,8 @@
     <w:p>
       <w:pPr>
         <w:pStyle w:val="3"/>
+        <w:spacing w:line="360" w:lineRule="auto"/>
+        <w:ind w:firstLine="480" w:firstLineChars="200"/>
         <w:rPr>
           <w:rFonts w:hint="eastAsia" w:ascii="宋体" w:hAnsi="宋体" w:eastAsia="宋体" w:cs="宋体"/>
           <w:color w:val="000000" w:themeColor="text1"/>
@@ -7934,6 +8128,7 @@
     <w:p>
       <w:pPr>
         <w:pStyle w:val="4"/>
+        <w:spacing w:line="360" w:lineRule="auto"/>
         <w:rPr>
           <w:rFonts w:hint="eastAsia" w:ascii="宋体" w:hAnsi="宋体" w:eastAsia="宋体" w:cs="宋体"/>
           <w:color w:val="000000" w:themeColor="text1"/>
@@ -7979,6 +8174,7 @@
     <w:p>
       <w:pPr>
         <w:pStyle w:val="5"/>
+        <w:spacing w:line="360" w:lineRule="auto"/>
         <w:rPr>
           <w:rFonts w:hint="eastAsia" w:ascii="宋体" w:hAnsi="宋体" w:eastAsia="宋体" w:cs="宋体"/>
           <w:color w:val="000000" w:themeColor="text1"/>
@@ -8024,6 +8220,8 @@
     <w:p>
       <w:pPr>
         <w:pStyle w:val="23"/>
+        <w:spacing w:line="360" w:lineRule="auto"/>
+        <w:ind w:firstLine="480" w:firstLineChars="200"/>
         <w:rPr>
           <w:rFonts w:hint="eastAsia" w:ascii="宋体" w:hAnsi="宋体" w:eastAsia="宋体" w:cs="宋体"/>
           <w:color w:val="000000" w:themeColor="text1"/>
@@ -8083,6 +8281,7 @@
     <w:p>
       <w:pPr>
         <w:pStyle w:val="5"/>
+        <w:spacing w:line="360" w:lineRule="auto"/>
         <w:rPr>
           <w:rFonts w:hint="eastAsia" w:ascii="宋体" w:hAnsi="宋体" w:eastAsia="宋体" w:cs="宋体"/>
           <w:color w:val="000000" w:themeColor="text1"/>
@@ -8162,6 +8361,7 @@
           <w:p>
             <w:pPr>
               <w:pStyle w:val="24"/>
+              <w:spacing w:line="360" w:lineRule="auto"/>
               <w:rPr>
                 <w:rFonts w:hint="eastAsia" w:ascii="宋体" w:hAnsi="宋体" w:eastAsia="宋体" w:cs="宋体"/>
                 <w:color w:val="000000" w:themeColor="text1"/>
@@ -8194,6 +8394,7 @@
           <w:p>
             <w:pPr>
               <w:pStyle w:val="24"/>
+              <w:spacing w:line="360" w:lineRule="auto"/>
               <w:rPr>
                 <w:rFonts w:hint="eastAsia" w:ascii="宋体" w:hAnsi="宋体" w:eastAsia="宋体" w:cs="宋体"/>
                 <w:color w:val="000000" w:themeColor="text1"/>
@@ -8226,6 +8427,7 @@
           <w:p>
             <w:pPr>
               <w:pStyle w:val="24"/>
+              <w:spacing w:line="360" w:lineRule="auto"/>
               <w:jc w:val="right"/>
               <w:rPr>
                 <w:rFonts w:hint="eastAsia" w:ascii="宋体" w:hAnsi="宋体" w:eastAsia="宋体" w:cs="宋体"/>
@@ -8259,6 +8461,7 @@
           <w:p>
             <w:pPr>
               <w:pStyle w:val="24"/>
+              <w:spacing w:line="360" w:lineRule="auto"/>
               <w:jc w:val="right"/>
               <w:rPr>
                 <w:rFonts w:hint="eastAsia" w:ascii="宋体" w:hAnsi="宋体" w:eastAsia="宋体" w:cs="宋体"/>
@@ -8292,6 +8495,7 @@
           <w:p>
             <w:pPr>
               <w:pStyle w:val="24"/>
+              <w:spacing w:line="360" w:lineRule="auto"/>
               <w:jc w:val="right"/>
               <w:rPr>
                 <w:rFonts w:hint="eastAsia" w:ascii="宋体" w:hAnsi="宋体" w:eastAsia="宋体" w:cs="宋体"/>
@@ -8325,6 +8529,7 @@
           <w:p>
             <w:pPr>
               <w:pStyle w:val="24"/>
+              <w:spacing w:line="360" w:lineRule="auto"/>
               <w:rPr>
                 <w:rFonts w:hint="eastAsia" w:ascii="宋体" w:hAnsi="宋体" w:eastAsia="宋体" w:cs="宋体"/>
                 <w:color w:val="000000" w:themeColor="text1"/>
@@ -8367,6 +8572,7 @@
           <w:p>
             <w:pPr>
               <w:pStyle w:val="24"/>
+              <w:spacing w:line="360" w:lineRule="auto"/>
               <w:rPr>
                 <w:rFonts w:hint="eastAsia" w:ascii="宋体" w:hAnsi="宋体" w:eastAsia="宋体" w:cs="宋体"/>
                 <w:color w:val="000000" w:themeColor="text1"/>
@@ -8399,6 +8605,7 @@
           <w:p>
             <w:pPr>
               <w:pStyle w:val="24"/>
+              <w:spacing w:line="360" w:lineRule="auto"/>
               <w:rPr>
                 <w:rFonts w:hint="eastAsia" w:ascii="宋体" w:hAnsi="宋体" w:eastAsia="宋体" w:cs="宋体"/>
                 <w:color w:val="000000" w:themeColor="text1"/>
@@ -8431,6 +8638,7 @@
           <w:p>
             <w:pPr>
               <w:pStyle w:val="24"/>
+              <w:spacing w:line="360" w:lineRule="auto"/>
               <w:jc w:val="right"/>
               <w:rPr>
                 <w:rFonts w:hint="eastAsia" w:ascii="宋体" w:hAnsi="宋体" w:eastAsia="宋体" w:cs="宋体"/>
@@ -8464,6 +8672,7 @@
           <w:p>
             <w:pPr>
               <w:pStyle w:val="24"/>
+              <w:spacing w:line="360" w:lineRule="auto"/>
               <w:jc w:val="right"/>
               <w:rPr>
                 <w:rFonts w:hint="eastAsia" w:ascii="宋体" w:hAnsi="宋体" w:eastAsia="宋体" w:cs="宋体"/>
@@ -8497,6 +8706,7 @@
           <w:p>
             <w:pPr>
               <w:pStyle w:val="24"/>
+              <w:spacing w:line="360" w:lineRule="auto"/>
               <w:jc w:val="right"/>
               <w:rPr>
                 <w:rFonts w:hint="eastAsia" w:ascii="宋体" w:hAnsi="宋体" w:eastAsia="宋体" w:cs="宋体"/>
@@ -8530,6 +8740,7 @@
           <w:p>
             <w:pPr>
               <w:pStyle w:val="24"/>
+              <w:spacing w:line="360" w:lineRule="auto"/>
               <w:rPr>
                 <w:rFonts w:hint="eastAsia" w:ascii="宋体" w:hAnsi="宋体" w:eastAsia="宋体" w:cs="宋体"/>
                 <w:color w:val="000000" w:themeColor="text1"/>
@@ -8572,6 +8783,7 @@
           <w:p>
             <w:pPr>
               <w:pStyle w:val="24"/>
+              <w:spacing w:line="360" w:lineRule="auto"/>
               <w:rPr>
                 <w:rFonts w:hint="eastAsia" w:ascii="宋体" w:hAnsi="宋体" w:eastAsia="宋体" w:cs="宋体"/>
                 <w:color w:val="000000" w:themeColor="text1"/>
@@ -8604,6 +8816,7 @@
           <w:p>
             <w:pPr>
               <w:pStyle w:val="24"/>
+              <w:spacing w:line="360" w:lineRule="auto"/>
               <w:rPr>
                 <w:rFonts w:hint="eastAsia" w:ascii="宋体" w:hAnsi="宋体" w:eastAsia="宋体" w:cs="宋体"/>
                 <w:color w:val="000000" w:themeColor="text1"/>
@@ -8636,6 +8849,7 @@
           <w:p>
             <w:pPr>
               <w:pStyle w:val="24"/>
+              <w:spacing w:line="360" w:lineRule="auto"/>
               <w:jc w:val="right"/>
               <w:rPr>
                 <w:rFonts w:hint="eastAsia" w:ascii="宋体" w:hAnsi="宋体" w:eastAsia="宋体" w:cs="宋体"/>
@@ -8669,6 +8883,7 @@
           <w:p>
             <w:pPr>
               <w:pStyle w:val="24"/>
+              <w:spacing w:line="360" w:lineRule="auto"/>
               <w:jc w:val="right"/>
               <w:rPr>
                 <w:rFonts w:hint="eastAsia" w:ascii="宋体" w:hAnsi="宋体" w:eastAsia="宋体" w:cs="宋体"/>
@@ -8702,6 +8917,7 @@
           <w:p>
             <w:pPr>
               <w:pStyle w:val="24"/>
+              <w:spacing w:line="360" w:lineRule="auto"/>
               <w:jc w:val="right"/>
               <w:rPr>
                 <w:rFonts w:hint="eastAsia" w:ascii="宋体" w:hAnsi="宋体" w:eastAsia="宋体" w:cs="宋体"/>
@@ -8735,6 +8951,7 @@
           <w:p>
             <w:pPr>
               <w:pStyle w:val="24"/>
+              <w:spacing w:line="360" w:lineRule="auto"/>
               <w:rPr>
                 <w:rFonts w:hint="eastAsia" w:ascii="宋体" w:hAnsi="宋体" w:eastAsia="宋体" w:cs="宋体"/>
                 <w:color w:val="000000" w:themeColor="text1"/>
@@ -8777,6 +8994,7 @@
           <w:p>
             <w:pPr>
               <w:pStyle w:val="24"/>
+              <w:spacing w:line="360" w:lineRule="auto"/>
               <w:rPr>
                 <w:rFonts w:hint="eastAsia" w:ascii="宋体" w:hAnsi="宋体" w:eastAsia="宋体" w:cs="宋体"/>
                 <w:color w:val="000000" w:themeColor="text1"/>
@@ -8809,6 +9027,7 @@
           <w:p>
             <w:pPr>
               <w:pStyle w:val="24"/>
+              <w:spacing w:line="360" w:lineRule="auto"/>
               <w:rPr>
                 <w:rFonts w:hint="eastAsia" w:ascii="宋体" w:hAnsi="宋体" w:eastAsia="宋体" w:cs="宋体"/>
                 <w:color w:val="000000" w:themeColor="text1"/>
@@ -8841,6 +9060,7 @@
           <w:p>
             <w:pPr>
               <w:pStyle w:val="24"/>
+              <w:spacing w:line="360" w:lineRule="auto"/>
               <w:jc w:val="right"/>
               <w:rPr>
                 <w:rFonts w:hint="eastAsia" w:ascii="宋体" w:hAnsi="宋体" w:eastAsia="宋体" w:cs="宋体"/>
@@ -8874,6 +9094,7 @@
           <w:p>
             <w:pPr>
               <w:pStyle w:val="24"/>
+              <w:spacing w:line="360" w:lineRule="auto"/>
               <w:jc w:val="right"/>
               <w:rPr>
                 <w:rFonts w:hint="eastAsia" w:ascii="宋体" w:hAnsi="宋体" w:eastAsia="宋体" w:cs="宋体"/>
@@ -8907,6 +9128,7 @@
           <w:p>
             <w:pPr>
               <w:pStyle w:val="24"/>
+              <w:spacing w:line="360" w:lineRule="auto"/>
               <w:jc w:val="right"/>
               <w:rPr>
                 <w:rFonts w:hint="eastAsia" w:ascii="宋体" w:hAnsi="宋体" w:eastAsia="宋体" w:cs="宋体"/>
@@ -8940,6 +9162,7 @@
           <w:p>
             <w:pPr>
               <w:pStyle w:val="24"/>
+              <w:spacing w:line="360" w:lineRule="auto"/>
               <w:rPr>
                 <w:rFonts w:hint="eastAsia" w:ascii="宋体" w:hAnsi="宋体" w:eastAsia="宋体" w:cs="宋体"/>
                 <w:color w:val="000000" w:themeColor="text1"/>
@@ -8982,6 +9205,7 @@
           <w:p>
             <w:pPr>
               <w:pStyle w:val="24"/>
+              <w:spacing w:line="360" w:lineRule="auto"/>
               <w:rPr>
                 <w:rFonts w:hint="eastAsia" w:ascii="宋体" w:hAnsi="宋体" w:eastAsia="宋体" w:cs="宋体"/>
                 <w:color w:val="000000" w:themeColor="text1"/>
@@ -9014,6 +9238,7 @@
           <w:p>
             <w:pPr>
               <w:pStyle w:val="24"/>
+              <w:spacing w:line="360" w:lineRule="auto"/>
               <w:rPr>
                 <w:rFonts w:hint="eastAsia" w:ascii="宋体" w:hAnsi="宋体" w:eastAsia="宋体" w:cs="宋体"/>
                 <w:color w:val="000000" w:themeColor="text1"/>
@@ -9046,6 +9271,7 @@
           <w:p>
             <w:pPr>
               <w:pStyle w:val="24"/>
+              <w:spacing w:line="360" w:lineRule="auto"/>
               <w:jc w:val="right"/>
               <w:rPr>
                 <w:rFonts w:hint="eastAsia" w:ascii="宋体" w:hAnsi="宋体" w:eastAsia="宋体" w:cs="宋体"/>
@@ -9079,6 +9305,7 @@
           <w:p>
             <w:pPr>
               <w:pStyle w:val="24"/>
+              <w:spacing w:line="360" w:lineRule="auto"/>
               <w:jc w:val="right"/>
               <w:rPr>
                 <w:rFonts w:hint="eastAsia" w:ascii="宋体" w:hAnsi="宋体" w:eastAsia="宋体" w:cs="宋体"/>
@@ -9112,6 +9339,7 @@
           <w:p>
             <w:pPr>
               <w:pStyle w:val="24"/>
+              <w:spacing w:line="360" w:lineRule="auto"/>
               <w:jc w:val="right"/>
               <w:rPr>
                 <w:rFonts w:hint="eastAsia" w:ascii="宋体" w:hAnsi="宋体" w:eastAsia="宋体" w:cs="宋体"/>
@@ -9145,6 +9373,7 @@
           <w:p>
             <w:pPr>
               <w:pStyle w:val="24"/>
+              <w:spacing w:line="360" w:lineRule="auto"/>
               <w:rPr>
                 <w:rFonts w:hint="eastAsia" w:ascii="宋体" w:hAnsi="宋体" w:eastAsia="宋体" w:cs="宋体"/>
                 <w:color w:val="000000" w:themeColor="text1"/>
@@ -9187,6 +9416,7 @@
           <w:p>
             <w:pPr>
               <w:pStyle w:val="24"/>
+              <w:spacing w:line="360" w:lineRule="auto"/>
               <w:rPr>
                 <w:rFonts w:hint="eastAsia" w:ascii="宋体" w:hAnsi="宋体" w:eastAsia="宋体" w:cs="宋体"/>
                 <w:color w:val="000000" w:themeColor="text1"/>
@@ -9219,6 +9449,7 @@
           <w:p>
             <w:pPr>
               <w:pStyle w:val="24"/>
+              <w:spacing w:line="360" w:lineRule="auto"/>
               <w:rPr>
                 <w:rFonts w:hint="eastAsia" w:ascii="宋体" w:hAnsi="宋体" w:eastAsia="宋体" w:cs="宋体"/>
                 <w:color w:val="000000" w:themeColor="text1"/>
@@ -9251,6 +9482,7 @@
           <w:p>
             <w:pPr>
               <w:pStyle w:val="24"/>
+              <w:spacing w:line="360" w:lineRule="auto"/>
               <w:jc w:val="right"/>
               <w:rPr>
                 <w:rFonts w:hint="eastAsia" w:ascii="宋体" w:hAnsi="宋体" w:eastAsia="宋体" w:cs="宋体"/>
@@ -9284,6 +9516,7 @@
           <w:p>
             <w:pPr>
               <w:pStyle w:val="24"/>
+              <w:spacing w:line="360" w:lineRule="auto"/>
               <w:jc w:val="right"/>
               <w:rPr>
                 <w:rFonts w:hint="eastAsia" w:ascii="宋体" w:hAnsi="宋体" w:eastAsia="宋体" w:cs="宋体"/>
@@ -9317,6 +9550,7 @@
           <w:p>
             <w:pPr>
               <w:pStyle w:val="24"/>
+              <w:spacing w:line="360" w:lineRule="auto"/>
               <w:jc w:val="right"/>
               <w:rPr>
                 <w:rFonts w:hint="eastAsia" w:ascii="宋体" w:hAnsi="宋体" w:eastAsia="宋体" w:cs="宋体"/>
@@ -9350,6 +9584,7 @@
           <w:p>
             <w:pPr>
               <w:pStyle w:val="24"/>
+              <w:spacing w:line="360" w:lineRule="auto"/>
               <w:rPr>
                 <w:rFonts w:hint="eastAsia" w:ascii="宋体" w:hAnsi="宋体" w:eastAsia="宋体" w:cs="宋体"/>
                 <w:color w:val="000000" w:themeColor="text1"/>
@@ -9384,6 +9619,7 @@
     <w:p>
       <w:pPr>
         <w:pStyle w:val="5"/>
+        <w:spacing w:line="360" w:lineRule="auto"/>
         <w:rPr>
           <w:rFonts w:hint="eastAsia" w:ascii="宋体" w:hAnsi="宋体" w:eastAsia="宋体" w:cs="宋体"/>
           <w:color w:val="000000" w:themeColor="text1"/>
@@ -9429,6 +9665,8 @@
     <w:p>
       <w:pPr>
         <w:pStyle w:val="23"/>
+        <w:spacing w:line="360" w:lineRule="auto"/>
+        <w:ind w:firstLine="480" w:firstLineChars="200"/>
         <w:rPr>
           <w:rFonts w:hint="eastAsia" w:ascii="宋体" w:hAnsi="宋体" w:eastAsia="宋体" w:cs="宋体"/>
           <w:color w:val="000000" w:themeColor="text1"/>
@@ -9571,6 +9809,7 @@
     <w:p>
       <w:pPr>
         <w:pStyle w:val="3"/>
+        <w:spacing w:line="360" w:lineRule="auto"/>
         <w:rPr>
           <w:rFonts w:hint="eastAsia" w:ascii="宋体" w:hAnsi="宋体" w:eastAsia="宋体" w:cs="宋体"/>
           <w:color w:val="000000" w:themeColor="text1"/>
@@ -9659,6 +9898,7 @@
     <w:p>
       <w:pPr>
         <w:pStyle w:val="4"/>
+        <w:spacing w:line="360" w:lineRule="auto"/>
         <w:rPr>
           <w:rFonts w:hint="eastAsia" w:ascii="宋体" w:hAnsi="宋体" w:eastAsia="宋体" w:cs="宋体"/>
           <w:color w:val="000000" w:themeColor="text1"/>
@@ -9704,6 +9944,7 @@
     <w:p>
       <w:pPr>
         <w:pStyle w:val="5"/>
+        <w:spacing w:line="360" w:lineRule="auto"/>
         <w:rPr>
           <w:rFonts w:hint="eastAsia" w:ascii="宋体" w:hAnsi="宋体" w:eastAsia="宋体" w:cs="宋体"/>
           <w:color w:val="000000" w:themeColor="text1"/>
@@ -9749,6 +9990,8 @@
     <w:p>
       <w:pPr>
         <w:pStyle w:val="23"/>
+        <w:spacing w:line="360" w:lineRule="auto"/>
+        <w:ind w:firstLine="480" w:firstLineChars="200"/>
         <w:rPr>
           <w:rFonts w:hint="eastAsia" w:ascii="宋体" w:hAnsi="宋体" w:eastAsia="宋体" w:cs="宋体"/>
           <w:color w:val="000000" w:themeColor="text1"/>
@@ -9836,6 +10079,7 @@
     <w:p>
       <w:pPr>
         <w:pStyle w:val="5"/>
+        <w:spacing w:line="360" w:lineRule="auto"/>
         <w:rPr>
           <w:rFonts w:hint="eastAsia" w:ascii="宋体" w:hAnsi="宋体" w:eastAsia="宋体" w:cs="宋体"/>
           <w:color w:val="000000" w:themeColor="text1"/>
@@ -9912,6 +10156,7 @@
           <w:p>
             <w:pPr>
               <w:pStyle w:val="24"/>
+              <w:spacing w:line="360" w:lineRule="auto"/>
               <w:rPr>
                 <w:rFonts w:hint="eastAsia" w:ascii="宋体" w:hAnsi="宋体" w:eastAsia="宋体" w:cs="宋体"/>
                 <w:color w:val="000000" w:themeColor="text1"/>
@@ -9944,6 +10189,7 @@
           <w:p>
             <w:pPr>
               <w:pStyle w:val="24"/>
+              <w:spacing w:line="360" w:lineRule="auto"/>
               <w:jc w:val="right"/>
               <w:rPr>
                 <w:rFonts w:hint="eastAsia" w:ascii="宋体" w:hAnsi="宋体" w:eastAsia="宋体" w:cs="宋体"/>
@@ -9977,6 +10223,7 @@
           <w:p>
             <w:pPr>
               <w:pStyle w:val="24"/>
+              <w:spacing w:line="360" w:lineRule="auto"/>
               <w:rPr>
                 <w:rFonts w:hint="eastAsia" w:ascii="宋体" w:hAnsi="宋体" w:eastAsia="宋体" w:cs="宋体"/>
                 <w:color w:val="000000" w:themeColor="text1"/>
@@ -10019,6 +10266,7 @@
           <w:p>
             <w:pPr>
               <w:pStyle w:val="24"/>
+              <w:spacing w:line="360" w:lineRule="auto"/>
               <w:rPr>
                 <w:rFonts w:hint="eastAsia" w:ascii="宋体" w:hAnsi="宋体" w:eastAsia="宋体" w:cs="宋体"/>
                 <w:color w:val="000000" w:themeColor="text1"/>
@@ -10051,6 +10299,7 @@
           <w:p>
             <w:pPr>
               <w:pStyle w:val="24"/>
+              <w:spacing w:line="360" w:lineRule="auto"/>
               <w:jc w:val="right"/>
               <w:rPr>
                 <w:rFonts w:hint="eastAsia" w:ascii="宋体" w:hAnsi="宋体" w:eastAsia="宋体" w:cs="宋体"/>
@@ -10084,6 +10333,7 @@
           <w:p>
             <w:pPr>
               <w:pStyle w:val="24"/>
+              <w:spacing w:line="360" w:lineRule="auto"/>
               <w:rPr>
                 <w:rFonts w:hint="eastAsia" w:ascii="宋体" w:hAnsi="宋体" w:eastAsia="宋体" w:cs="宋体"/>
                 <w:color w:val="000000" w:themeColor="text1"/>
@@ -10126,6 +10376,7 @@
           <w:p>
             <w:pPr>
               <w:pStyle w:val="24"/>
+              <w:spacing w:line="360" w:lineRule="auto"/>
               <w:rPr>
                 <w:rFonts w:hint="eastAsia" w:ascii="宋体" w:hAnsi="宋体" w:eastAsia="宋体" w:cs="宋体"/>
                 <w:color w:val="000000" w:themeColor="text1"/>
@@ -10158,6 +10409,7 @@
           <w:p>
             <w:pPr>
               <w:pStyle w:val="24"/>
+              <w:spacing w:line="360" w:lineRule="auto"/>
               <w:jc w:val="right"/>
               <w:rPr>
                 <w:rFonts w:hint="eastAsia" w:ascii="宋体" w:hAnsi="宋体" w:eastAsia="宋体" w:cs="宋体"/>
@@ -10191,6 +10443,7 @@
           <w:p>
             <w:pPr>
               <w:pStyle w:val="24"/>
+              <w:spacing w:line="360" w:lineRule="auto"/>
               <w:rPr>
                 <w:rFonts w:hint="eastAsia" w:ascii="宋体" w:hAnsi="宋体" w:eastAsia="宋体" w:cs="宋体"/>
                 <w:color w:val="000000" w:themeColor="text1"/>
@@ -10262,6 +10515,7 @@
           <w:p>
             <w:pPr>
               <w:pStyle w:val="24"/>
+              <w:spacing w:line="360" w:lineRule="auto"/>
               <w:rPr>
                 <w:rFonts w:hint="eastAsia" w:ascii="宋体" w:hAnsi="宋体" w:eastAsia="宋体" w:cs="宋体"/>
                 <w:color w:val="000000" w:themeColor="text1"/>
@@ -10322,6 +10576,7 @@
           <w:p>
             <w:pPr>
               <w:pStyle w:val="24"/>
+              <w:spacing w:line="360" w:lineRule="auto"/>
               <w:jc w:val="right"/>
               <w:rPr>
                 <w:rFonts w:hint="eastAsia" w:ascii="宋体" w:hAnsi="宋体" w:eastAsia="宋体" w:cs="宋体"/>
@@ -10355,6 +10610,7 @@
           <w:p>
             <w:pPr>
               <w:pStyle w:val="24"/>
+              <w:spacing w:line="360" w:lineRule="auto"/>
               <w:rPr>
                 <w:rFonts w:hint="eastAsia" w:ascii="宋体" w:hAnsi="宋体" w:eastAsia="宋体" w:cs="宋体"/>
                 <w:color w:val="000000" w:themeColor="text1"/>
@@ -10397,6 +10653,7 @@
           <w:p>
             <w:pPr>
               <w:pStyle w:val="24"/>
+              <w:spacing w:line="360" w:lineRule="auto"/>
               <w:rPr>
                 <w:rFonts w:hint="eastAsia" w:ascii="宋体" w:hAnsi="宋体" w:eastAsia="宋体" w:cs="宋体"/>
                 <w:color w:val="000000" w:themeColor="text1"/>
@@ -10457,6 +10714,7 @@
           <w:p>
             <w:pPr>
               <w:pStyle w:val="24"/>
+              <w:spacing w:line="360" w:lineRule="auto"/>
               <w:jc w:val="right"/>
               <w:rPr>
                 <w:rFonts w:hint="eastAsia" w:ascii="宋体" w:hAnsi="宋体" w:eastAsia="宋体" w:cs="宋体"/>
@@ -10490,6 +10748,7 @@
           <w:p>
             <w:pPr>
               <w:pStyle w:val="24"/>
+              <w:spacing w:line="360" w:lineRule="auto"/>
               <w:rPr>
                 <w:rFonts w:hint="eastAsia" w:ascii="宋体" w:hAnsi="宋体" w:eastAsia="宋体" w:cs="宋体"/>
                 <w:color w:val="000000" w:themeColor="text1"/>
@@ -10546,6 +10805,7 @@
           <w:p>
             <w:pPr>
               <w:pStyle w:val="24"/>
+              <w:spacing w:line="360" w:lineRule="auto"/>
               <w:rPr>
                 <w:rFonts w:hint="eastAsia" w:ascii="宋体" w:hAnsi="宋体" w:eastAsia="宋体" w:cs="宋体"/>
                 <w:color w:val="000000" w:themeColor="text1"/>
@@ -10578,6 +10838,7 @@
           <w:p>
             <w:pPr>
               <w:pStyle w:val="24"/>
+              <w:spacing w:line="360" w:lineRule="auto"/>
               <w:jc w:val="right"/>
               <w:rPr>
                 <w:rFonts w:hint="eastAsia" w:ascii="宋体" w:hAnsi="宋体" w:eastAsia="宋体" w:cs="宋体"/>
@@ -10611,6 +10872,7 @@
           <w:p>
             <w:pPr>
               <w:pStyle w:val="24"/>
+              <w:spacing w:line="360" w:lineRule="auto"/>
               <w:rPr>
                 <w:rFonts w:hint="eastAsia" w:ascii="宋体" w:hAnsi="宋体" w:eastAsia="宋体" w:cs="宋体"/>
                 <w:color w:val="000000" w:themeColor="text1"/>
@@ -10667,6 +10929,7 @@
           <w:p>
             <w:pPr>
               <w:pStyle w:val="24"/>
+              <w:spacing w:line="360" w:lineRule="auto"/>
               <w:rPr>
                 <w:rFonts w:hint="eastAsia" w:ascii="宋体" w:hAnsi="宋体" w:eastAsia="宋体" w:cs="宋体"/>
                 <w:color w:val="000000" w:themeColor="text1"/>
@@ -10699,6 +10962,7 @@
           <w:p>
             <w:pPr>
               <w:pStyle w:val="24"/>
+              <w:spacing w:line="360" w:lineRule="auto"/>
               <w:jc w:val="right"/>
               <w:rPr>
                 <w:rFonts w:hint="eastAsia" w:ascii="宋体" w:hAnsi="宋体" w:eastAsia="宋体" w:cs="宋体"/>
@@ -10732,6 +10996,7 @@
           <w:p>
             <w:pPr>
               <w:pStyle w:val="24"/>
+              <w:spacing w:line="360" w:lineRule="auto"/>
               <w:rPr>
                 <w:rFonts w:hint="eastAsia" w:ascii="宋体" w:hAnsi="宋体" w:eastAsia="宋体" w:cs="宋体"/>
                 <w:color w:val="000000" w:themeColor="text1"/>
@@ -10774,6 +11039,7 @@
           <w:p>
             <w:pPr>
               <w:pStyle w:val="24"/>
+              <w:spacing w:line="360" w:lineRule="auto"/>
               <w:rPr>
                 <w:rFonts w:hint="eastAsia" w:ascii="宋体" w:hAnsi="宋体" w:eastAsia="宋体" w:cs="宋体"/>
                 <w:color w:val="000000" w:themeColor="text1"/>
@@ -10820,6 +11086,7 @@
           <w:p>
             <w:pPr>
               <w:pStyle w:val="24"/>
+              <w:spacing w:line="360" w:lineRule="auto"/>
               <w:jc w:val="right"/>
               <w:rPr>
                 <w:rFonts w:hint="eastAsia" w:ascii="宋体" w:hAnsi="宋体" w:eastAsia="宋体" w:cs="宋体"/>
@@ -10853,6 +11120,7 @@
           <w:p>
             <w:pPr>
               <w:pStyle w:val="24"/>
+              <w:spacing w:line="360" w:lineRule="auto"/>
               <w:rPr>
                 <w:rFonts w:hint="eastAsia" w:ascii="宋体" w:hAnsi="宋体" w:eastAsia="宋体" w:cs="宋体"/>
                 <w:color w:val="000000" w:themeColor="text1"/>
@@ -10895,6 +11163,7 @@
           <w:p>
             <w:pPr>
               <w:pStyle w:val="24"/>
+              <w:spacing w:line="360" w:lineRule="auto"/>
               <w:rPr>
                 <w:rFonts w:hint="eastAsia" w:ascii="宋体" w:hAnsi="宋体" w:eastAsia="宋体" w:cs="宋体"/>
                 <w:color w:val="000000" w:themeColor="text1"/>
@@ -10927,6 +11196,7 @@
           <w:p>
             <w:pPr>
               <w:pStyle w:val="24"/>
+              <w:spacing w:line="360" w:lineRule="auto"/>
               <w:jc w:val="right"/>
               <w:rPr>
                 <w:rFonts w:hint="eastAsia" w:ascii="宋体" w:hAnsi="宋体" w:eastAsia="宋体" w:cs="宋体"/>
@@ -10974,6 +11244,7 @@
           <w:p>
             <w:pPr>
               <w:pStyle w:val="24"/>
+              <w:spacing w:line="360" w:lineRule="auto"/>
               <w:rPr>
                 <w:rFonts w:hint="eastAsia" w:ascii="宋体" w:hAnsi="宋体" w:eastAsia="宋体" w:cs="宋体"/>
                 <w:color w:val="000000" w:themeColor="text1"/>
@@ -11022,6 +11293,7 @@
     <w:p>
       <w:pPr>
         <w:pStyle w:val="5"/>
+        <w:spacing w:line="360" w:lineRule="auto"/>
         <w:rPr>
           <w:rFonts w:hint="eastAsia" w:ascii="宋体" w:hAnsi="宋体" w:eastAsia="宋体" w:cs="宋体"/>
           <w:color w:val="000000" w:themeColor="text1"/>
@@ -11067,6 +11339,8 @@
     <w:p>
       <w:pPr>
         <w:pStyle w:val="23"/>
+        <w:spacing w:line="360" w:lineRule="auto"/>
+        <w:ind w:firstLine="480" w:firstLineChars="200"/>
         <w:rPr>
           <w:rFonts w:hint="eastAsia" w:ascii="宋体" w:hAnsi="宋体" w:eastAsia="宋体" w:cs="宋体"/>
           <w:color w:val="000000" w:themeColor="text1"/>
@@ -11239,6 +11513,7 @@
     <w:p>
       <w:pPr>
         <w:pStyle w:val="4"/>
+        <w:spacing w:line="360" w:lineRule="auto"/>
         <w:rPr>
           <w:rFonts w:hint="eastAsia" w:ascii="宋体" w:hAnsi="宋体" w:eastAsia="宋体" w:cs="宋体"/>
           <w:color w:val="000000" w:themeColor="text1"/>
@@ -11267,8 +11542,6 @@
         </w:rPr>
         <w:t>8</w:t>
       </w:r>
-      <w:bookmarkStart w:id="21" w:name="_GoBack"/>
-      <w:bookmarkEnd w:id="21"/>
       <w:r>
         <w:rPr>
           <w:rFonts w:hint="eastAsia" w:ascii="宋体" w:hAnsi="宋体" w:eastAsia="宋体" w:cs="宋体"/>
@@ -11301,6 +11574,8 @@
     <w:p>
       <w:pPr>
         <w:pStyle w:val="23"/>
+        <w:spacing w:line="360" w:lineRule="auto"/>
+        <w:ind w:firstLine="480" w:firstLineChars="200"/>
         <w:rPr>
           <w:rFonts w:hint="eastAsia" w:ascii="宋体" w:hAnsi="宋体" w:eastAsia="宋体" w:cs="宋体"/>
           <w:color w:val="000000" w:themeColor="text1"/>
@@ -11443,6 +11718,7 @@
     <w:p>
       <w:pPr>
         <w:pStyle w:val="3"/>
+        <w:spacing w:line="360" w:lineRule="auto"/>
         <w:rPr>
           <w:rFonts w:hint="eastAsia" w:ascii="宋体" w:hAnsi="宋体" w:eastAsia="宋体" w:cs="宋体"/>
           <w:color w:val="000000" w:themeColor="text1"/>
@@ -11505,6 +11781,7 @@
           <w:p>
             <w:pPr>
               <w:pStyle w:val="24"/>
+              <w:spacing w:line="360" w:lineRule="auto"/>
               <w:rPr>
                 <w:rFonts w:hint="eastAsia" w:ascii="宋体" w:hAnsi="宋体" w:eastAsia="宋体" w:cs="宋体"/>
                 <w:color w:val="000000" w:themeColor="text1"/>
@@ -11537,6 +11814,7 @@
           <w:p>
             <w:pPr>
               <w:pStyle w:val="24"/>
+              <w:spacing w:line="360" w:lineRule="auto"/>
               <w:jc w:val="right"/>
               <w:rPr>
                 <w:rFonts w:hint="eastAsia" w:ascii="宋体" w:hAnsi="宋体" w:eastAsia="宋体" w:cs="宋体"/>
@@ -11570,6 +11848,7 @@
           <w:p>
             <w:pPr>
               <w:pStyle w:val="24"/>
+              <w:spacing w:line="360" w:lineRule="auto"/>
               <w:jc w:val="right"/>
               <w:rPr>
                 <w:rFonts w:hint="eastAsia" w:ascii="宋体" w:hAnsi="宋体" w:eastAsia="宋体" w:cs="宋体"/>
@@ -11603,6 +11882,7 @@
           <w:p>
             <w:pPr>
               <w:pStyle w:val="24"/>
+              <w:spacing w:line="360" w:lineRule="auto"/>
               <w:rPr>
                 <w:rFonts w:hint="eastAsia" w:ascii="宋体" w:hAnsi="宋体" w:eastAsia="宋体" w:cs="宋体"/>
                 <w:color w:val="000000" w:themeColor="text1"/>
@@ -11645,6 +11925,7 @@
           <w:p>
             <w:pPr>
               <w:pStyle w:val="24"/>
+              <w:spacing w:line="360" w:lineRule="auto"/>
               <w:rPr>
                 <w:rFonts w:hint="eastAsia" w:ascii="宋体" w:hAnsi="宋体" w:eastAsia="宋体" w:cs="宋体"/>
                 <w:color w:val="000000" w:themeColor="text1"/>
@@ -11691,6 +11972,7 @@
           <w:p>
             <w:pPr>
               <w:pStyle w:val="24"/>
+              <w:spacing w:line="360" w:lineRule="auto"/>
               <w:jc w:val="right"/>
               <w:rPr>
                 <w:rFonts w:hint="eastAsia" w:ascii="宋体" w:hAnsi="宋体" w:eastAsia="宋体" w:cs="宋体"/>
@@ -11724,6 +12006,7 @@
           <w:p>
             <w:pPr>
               <w:pStyle w:val="24"/>
+              <w:spacing w:line="360" w:lineRule="auto"/>
               <w:jc w:val="right"/>
               <w:rPr>
                 <w:rFonts w:hint="eastAsia" w:ascii="宋体" w:hAnsi="宋体" w:eastAsia="宋体" w:cs="宋体"/>
@@ -11771,6 +12054,7 @@
           <w:p>
             <w:pPr>
               <w:pStyle w:val="24"/>
+              <w:spacing w:line="360" w:lineRule="auto"/>
               <w:rPr>
                 <w:rFonts w:hint="eastAsia" w:ascii="宋体" w:hAnsi="宋体" w:eastAsia="宋体" w:cs="宋体"/>
                 <w:color w:val="000000" w:themeColor="text1"/>
@@ -11813,6 +12097,7 @@
           <w:p>
             <w:pPr>
               <w:pStyle w:val="24"/>
+              <w:spacing w:line="360" w:lineRule="auto"/>
               <w:rPr>
                 <w:rFonts w:hint="eastAsia" w:ascii="宋体" w:hAnsi="宋体" w:eastAsia="宋体" w:cs="宋体"/>
                 <w:color w:val="000000" w:themeColor="text1"/>
@@ -11859,6 +12144,7 @@
           <w:p>
             <w:pPr>
               <w:pStyle w:val="24"/>
+              <w:spacing w:line="360" w:lineRule="auto"/>
               <w:jc w:val="right"/>
               <w:rPr>
                 <w:rFonts w:hint="eastAsia" w:ascii="宋体" w:hAnsi="宋体" w:eastAsia="宋体" w:cs="宋体"/>
@@ -11892,6 +12178,7 @@
           <w:p>
             <w:pPr>
               <w:pStyle w:val="24"/>
+              <w:spacing w:line="360" w:lineRule="auto"/>
               <w:jc w:val="right"/>
               <w:rPr>
                 <w:rFonts w:hint="eastAsia" w:ascii="宋体" w:hAnsi="宋体" w:eastAsia="宋体" w:cs="宋体"/>
@@ -11939,6 +12226,7 @@
           <w:p>
             <w:pPr>
               <w:pStyle w:val="24"/>
+              <w:spacing w:line="360" w:lineRule="auto"/>
               <w:rPr>
                 <w:rFonts w:hint="eastAsia" w:ascii="宋体" w:hAnsi="宋体" w:eastAsia="宋体" w:cs="宋体"/>
                 <w:color w:val="000000" w:themeColor="text1"/>
@@ -11981,6 +12269,7 @@
           <w:p>
             <w:pPr>
               <w:pStyle w:val="24"/>
+              <w:spacing w:line="360" w:lineRule="auto"/>
               <w:rPr>
                 <w:rFonts w:hint="eastAsia" w:ascii="宋体" w:hAnsi="宋体" w:eastAsia="宋体" w:cs="宋体"/>
                 <w:color w:val="000000" w:themeColor="text1"/>
@@ -12013,6 +12302,7 @@
           <w:p>
             <w:pPr>
               <w:pStyle w:val="24"/>
+              <w:spacing w:line="360" w:lineRule="auto"/>
               <w:jc w:val="right"/>
               <w:rPr>
                 <w:rFonts w:hint="eastAsia" w:ascii="宋体" w:hAnsi="宋体" w:eastAsia="宋体" w:cs="宋体"/>
@@ -12046,6 +12336,7 @@
           <w:p>
             <w:pPr>
               <w:pStyle w:val="24"/>
+              <w:spacing w:line="360" w:lineRule="auto"/>
               <w:jc w:val="right"/>
               <w:rPr>
                 <w:rFonts w:hint="eastAsia" w:ascii="宋体" w:hAnsi="宋体" w:eastAsia="宋体" w:cs="宋体"/>
@@ -12121,6 +12412,7 @@
           <w:p>
             <w:pPr>
               <w:pStyle w:val="24"/>
+              <w:spacing w:line="360" w:lineRule="auto"/>
               <w:rPr>
                 <w:rFonts w:hint="eastAsia" w:ascii="宋体" w:hAnsi="宋体" w:eastAsia="宋体" w:cs="宋体"/>
                 <w:color w:val="000000" w:themeColor="text1"/>
@@ -12163,6 +12455,7 @@
           <w:p>
             <w:pPr>
               <w:pStyle w:val="24"/>
+              <w:spacing w:line="360" w:lineRule="auto"/>
               <w:rPr>
                 <w:rFonts w:hint="eastAsia" w:ascii="宋体" w:hAnsi="宋体" w:eastAsia="宋体" w:cs="宋体"/>
                 <w:color w:val="000000" w:themeColor="text1"/>
@@ -12195,6 +12488,7 @@
           <w:p>
             <w:pPr>
               <w:pStyle w:val="24"/>
+              <w:spacing w:line="360" w:lineRule="auto"/>
               <w:jc w:val="right"/>
               <w:rPr>
                 <w:rFonts w:hint="eastAsia" w:ascii="宋体" w:hAnsi="宋体" w:eastAsia="宋体" w:cs="宋体"/>
@@ -12228,6 +12522,7 @@
           <w:p>
             <w:pPr>
               <w:pStyle w:val="24"/>
+              <w:spacing w:line="360" w:lineRule="auto"/>
               <w:jc w:val="right"/>
               <w:rPr>
                 <w:rFonts w:hint="eastAsia" w:ascii="宋体" w:hAnsi="宋体" w:eastAsia="宋体" w:cs="宋体"/>
@@ -12303,6 +12598,7 @@
           <w:p>
             <w:pPr>
               <w:pStyle w:val="24"/>
+              <w:spacing w:line="360" w:lineRule="auto"/>
               <w:rPr>
                 <w:rFonts w:hint="eastAsia" w:ascii="宋体" w:hAnsi="宋体" w:eastAsia="宋体" w:cs="宋体"/>
                 <w:color w:val="000000" w:themeColor="text1"/>
@@ -12345,6 +12641,7 @@
           <w:p>
             <w:pPr>
               <w:pStyle w:val="24"/>
+              <w:spacing w:line="360" w:lineRule="auto"/>
               <w:rPr>
                 <w:rFonts w:hint="eastAsia" w:ascii="宋体" w:hAnsi="宋体" w:eastAsia="宋体" w:cs="宋体"/>
                 <w:color w:val="000000" w:themeColor="text1"/>
@@ -12377,6 +12674,7 @@
           <w:p>
             <w:pPr>
               <w:pStyle w:val="24"/>
+              <w:spacing w:line="360" w:lineRule="auto"/>
               <w:jc w:val="right"/>
               <w:rPr>
                 <w:rFonts w:hint="eastAsia" w:ascii="宋体" w:hAnsi="宋体" w:eastAsia="宋体" w:cs="宋体"/>
@@ -12452,6 +12750,7 @@
           <w:p>
             <w:pPr>
               <w:pStyle w:val="24"/>
+              <w:spacing w:line="360" w:lineRule="auto"/>
               <w:jc w:val="right"/>
               <w:rPr>
                 <w:rFonts w:hint="eastAsia" w:ascii="宋体" w:hAnsi="宋体" w:eastAsia="宋体" w:cs="宋体"/>
@@ -12527,6 +12826,7 @@
           <w:p>
             <w:pPr>
               <w:pStyle w:val="24"/>
+              <w:spacing w:line="360" w:lineRule="auto"/>
               <w:rPr>
                 <w:rFonts w:hint="eastAsia" w:ascii="宋体" w:hAnsi="宋体" w:eastAsia="宋体" w:cs="宋体"/>
                 <w:color w:val="000000" w:themeColor="text1"/>
@@ -12560,6 +12860,8 @@
     <w:p>
       <w:pPr>
         <w:pStyle w:val="3"/>
+        <w:spacing w:line="360" w:lineRule="auto"/>
+        <w:ind w:firstLine="480" w:firstLineChars="200"/>
         <w:rPr>
           <w:rFonts w:hint="eastAsia" w:ascii="宋体" w:hAnsi="宋体" w:eastAsia="宋体" w:cs="宋体"/>
           <w:color w:val="000000" w:themeColor="text1"/>
@@ -12572,6 +12874,8 @@
           </w14:textFill>
         </w:rPr>
       </w:pPr>
+      <w:bookmarkStart w:id="21" w:name="_GoBack"/>
+      <w:bookmarkEnd w:id="21"/>
       <w:r>
         <w:rPr>
           <w:rFonts w:hint="eastAsia" w:ascii="宋体" w:hAnsi="宋体" w:eastAsia="宋体" w:cs="宋体"/>

</xml_diff>